<commit_message>
Deploying to gh-pages from @ nlmixr2/monolix2rx@ca1ffea087e2a48ffbafe9e758e59bf7f8efa59a 🚀
</commit_message>
<xml_diff>
--- a/articles/mod-Word.docx
+++ b/articles/mod-Word.docx
@@ -31,7 +31,6 @@
           <w:trHeight w:val="607" w:hRule="auto"/>
           <w:tblHeader/>
         </w:trPr>
-        header1
         <w:tc>
           <w:tcPr>
             <w:tcBorders>
@@ -51,6 +50,7 @@
           </w:tcPr>
           <w:p>
             <w:pPr>
+              <w:pStyle w:val="Normal"/>
               <w:jc w:val="left"/>
               <w:pBdr>
                 <w:bottom w:val="none" w:sz="0" w:space="0" w:color="000000"/>
@@ -65,6 +65,7 @@
                 <w:i w:val="false"/>
                 <w:b w:val="false"/>
                 <w:u w:val="none"/>
+                <w:strike w:val="false"/>
                 <w:sz w:val="22"/>
                 <w:szCs w:val="22"/>
                 <w:color w:val="000000"/>
@@ -76,6 +77,7 @@
                 <w:i w:val="false"/>
                 <w:b w:val="false"/>
                 <w:u w:val="none"/>
+                <w:strike w:val="false"/>
                 <w:sz w:val="22"/>
                 <w:szCs w:val="22"/>
                 <w:color w:val="000000"/>
@@ -103,6 +105,7 @@
           </w:tcPr>
           <w:p>
             <w:pPr>
+              <w:pStyle w:val="Normal"/>
               <w:jc w:val="left"/>
               <w:pBdr>
                 <w:bottom w:val="none" w:sz="0" w:space="0" w:color="000000"/>
@@ -117,6 +120,7 @@
                 <w:i w:val="false"/>
                 <w:b w:val="false"/>
                 <w:u w:val="none"/>
+                <w:strike w:val="false"/>
                 <w:sz w:val="22"/>
                 <w:szCs w:val="22"/>
                 <w:color w:val="000000"/>
@@ -128,6 +132,7 @@
                 <w:i w:val="false"/>
                 <w:b w:val="false"/>
                 <w:u w:val="none"/>
+                <w:strike w:val="false"/>
                 <w:sz w:val="22"/>
                 <w:szCs w:val="22"/>
                 <w:color w:val="000000"/>
@@ -155,6 +160,7 @@
           </w:tcPr>
           <w:p>
             <w:pPr>
+              <w:pStyle w:val="Normal"/>
               <w:jc w:val="left"/>
               <w:pBdr>
                 <w:bottom w:val="none" w:sz="0" w:space="0" w:color="000000"/>
@@ -169,6 +175,7 @@
                 <w:i w:val="false"/>
                 <w:b w:val="false"/>
                 <w:u w:val="none"/>
+                <w:strike w:val="false"/>
                 <w:sz w:val="22"/>
                 <w:szCs w:val="22"/>
                 <w:color w:val="000000"/>
@@ -180,6 +187,7 @@
                 <w:i w:val="false"/>
                 <w:b w:val="false"/>
                 <w:u w:val="none"/>
+                <w:strike w:val="false"/>
                 <w:sz w:val="22"/>
                 <w:szCs w:val="22"/>
                 <w:color w:val="000000"/>
@@ -207,6 +215,7 @@
           </w:tcPr>
           <w:p>
             <w:pPr>
+              <w:pStyle w:val="Normal"/>
               <w:jc w:val="left"/>
               <w:pBdr>
                 <w:bottom w:val="none" w:sz="0" w:space="0" w:color="000000"/>
@@ -221,6 +230,7 @@
                 <w:i w:val="false"/>
                 <w:b w:val="false"/>
                 <w:u w:val="none"/>
+                <w:strike w:val="false"/>
                 <w:sz w:val="22"/>
                 <w:szCs w:val="22"/>
                 <w:color w:val="000000"/>
@@ -232,6 +242,7 @@
                 <w:i w:val="false"/>
                 <w:b w:val="false"/>
                 <w:u w:val="none"/>
+                <w:strike w:val="false"/>
                 <w:sz w:val="22"/>
                 <w:szCs w:val="22"/>
                 <w:color w:val="000000"/>
@@ -259,6 +270,7 @@
           </w:tcPr>
           <w:p>
             <w:pPr>
+              <w:pStyle w:val="Normal"/>
               <w:jc w:val="left"/>
               <w:pBdr>
                 <w:bottom w:val="none" w:sz="0" w:space="0" w:color="000000"/>
@@ -273,6 +285,7 @@
                 <w:i w:val="false"/>
                 <w:b w:val="false"/>
                 <w:u w:val="none"/>
+                <w:strike w:val="false"/>
                 <w:sz w:val="22"/>
                 <w:szCs w:val="22"/>
                 <w:color w:val="000000"/>
@@ -284,6 +297,7 @@
                 <w:i w:val="false"/>
                 <w:b w:val="false"/>
                 <w:u w:val="none"/>
+                <w:strike w:val="false"/>
                 <w:sz w:val="22"/>
                 <w:szCs w:val="22"/>
                 <w:color w:val="000000"/>
@@ -311,6 +325,7 @@
           </w:tcPr>
           <w:p>
             <w:pPr>
+              <w:pStyle w:val="Normal"/>
               <w:jc w:val="left"/>
               <w:pBdr>
                 <w:bottom w:val="none" w:sz="0" w:space="0" w:color="000000"/>
@@ -325,6 +340,7 @@
                 <w:i w:val="false"/>
                 <w:b w:val="false"/>
                 <w:u w:val="none"/>
+                <w:strike w:val="false"/>
                 <w:sz w:val="22"/>
                 <w:szCs w:val="22"/>
                 <w:color w:val="000000"/>
@@ -336,6 +352,7 @@
                 <w:i w:val="false"/>
                 <w:b w:val="false"/>
                 <w:u w:val="none"/>
+                <w:strike w:val="false"/>
                 <w:sz w:val="22"/>
                 <w:szCs w:val="22"/>
                 <w:color w:val="000000"/>
@@ -363,6 +380,7 @@
           </w:tcPr>
           <w:p>
             <w:pPr>
+              <w:pStyle w:val="Normal"/>
               <w:jc w:val="left"/>
               <w:pBdr>
                 <w:bottom w:val="none" w:sz="0" w:space="0" w:color="000000"/>
@@ -377,6 +395,7 @@
                 <w:i w:val="false"/>
                 <w:b w:val="false"/>
                 <w:u w:val="none"/>
+                <w:strike w:val="false"/>
                 <w:sz w:val="22"/>
                 <w:szCs w:val="22"/>
                 <w:color w:val="000000"/>
@@ -388,6 +407,7 @@
                 <w:i w:val="false"/>
                 <w:b w:val="false"/>
                 <w:u w:val="none"/>
+                <w:strike w:val="false"/>
                 <w:sz w:val="22"/>
                 <w:szCs w:val="22"/>
                 <w:color w:val="000000"/>
@@ -401,7 +421,6 @@
         <w:trPr>
           <w:trHeight w:val="638" w:hRule="auto"/>
         </w:trPr>
-        body1
         <w:tc>
           <w:tcPr>
             <w:tcBorders>
@@ -421,6 +440,7 @@
           </w:tcPr>
           <w:p>
             <w:pPr>
+              <w:pStyle w:val="Normal"/>
               <w:jc w:val="left"/>
               <w:pBdr>
                 <w:bottom w:val="none" w:sz="0" w:space="0" w:color="000000"/>
@@ -435,6 +455,7 @@
                 <w:i w:val="false"/>
                 <w:b w:val="false"/>
                 <w:u w:val="none"/>
+                <w:strike w:val="false"/>
                 <w:sz w:val="22"/>
                 <w:szCs w:val="22"/>
                 <w:color w:val="000000"/>
@@ -446,6 +467,7 @@
                 <w:i w:val="false"/>
                 <w:b w:val="false"/>
                 <w:u w:val="none"/>
+                <w:strike w:val="false"/>
                 <w:sz w:val="24"/>
                 <w:szCs w:val="24"/>
                 <w:color w:val="000000"/>
@@ -473,6 +495,7 @@
           </w:tcPr>
           <w:p>
             <w:pPr>
+              <w:pStyle w:val="Normal"/>
               <w:jc w:val="left"/>
               <w:pBdr>
                 <w:bottom w:val="none" w:sz="0" w:space="0" w:color="000000"/>
@@ -487,6 +510,7 @@
                 <w:i w:val="false"/>
                 <w:b w:val="false"/>
                 <w:u w:val="none"/>
+                <w:strike w:val="false"/>
                 <w:sz w:val="22"/>
                 <w:szCs w:val="22"/>
                 <w:color w:val="000000"/>
@@ -498,6 +522,7 @@
                 <w:i w:val="false"/>
                 <w:b w:val="false"/>
                 <w:u w:val="none"/>
+                <w:strike w:val="false"/>
                 <w:sz w:val="22"/>
                 <w:szCs w:val="22"/>
                 <w:color w:val="000000"/>
@@ -525,6 +550,7 @@
           </w:tcPr>
           <w:p>
             <w:pPr>
+              <w:pStyle w:val="Normal"/>
               <w:jc w:val="left"/>
               <w:pBdr>
                 <w:bottom w:val="none" w:sz="0" w:space="0" w:color="000000"/>
@@ -539,6 +565,7 @@
                 <w:i w:val="false"/>
                 <w:b w:val="false"/>
                 <w:u w:val="none"/>
+                <w:strike w:val="false"/>
                 <w:sz w:val="22"/>
                 <w:szCs w:val="22"/>
                 <w:color w:val="000000"/>
@@ -550,6 +577,7 @@
                 <w:i w:val="false"/>
                 <w:b w:val="false"/>
                 <w:u w:val="none"/>
+                <w:strike w:val="false"/>
                 <w:sz w:val="22"/>
                 <w:szCs w:val="22"/>
                 <w:color w:val="000000"/>
@@ -577,6 +605,7 @@
           </w:tcPr>
           <w:p>
             <w:pPr>
+              <w:pStyle w:val="Normal"/>
               <w:jc w:val="left"/>
               <w:pBdr>
                 <w:bottom w:val="none" w:sz="0" w:space="0" w:color="000000"/>
@@ -591,6 +620,7 @@
                 <w:i w:val="false"/>
                 <w:b w:val="false"/>
                 <w:u w:val="none"/>
+                <w:strike w:val="false"/>
                 <w:sz w:val="22"/>
                 <w:szCs w:val="22"/>
                 <w:color w:val="000000"/>
@@ -602,6 +632,7 @@
                 <w:i w:val="false"/>
                 <w:b w:val="false"/>
                 <w:u w:val="none"/>
+                <w:strike w:val="false"/>
                 <w:sz w:val="22"/>
                 <w:szCs w:val="22"/>
                 <w:color w:val="000000"/>
@@ -629,6 +660,7 @@
           </w:tcPr>
           <w:p>
             <w:pPr>
+              <w:pStyle w:val="Normal"/>
               <w:jc w:val="left"/>
               <w:pBdr>
                 <w:bottom w:val="none" w:sz="0" w:space="0" w:color="000000"/>
@@ -643,6 +675,7 @@
                 <w:i w:val="false"/>
                 <w:b w:val="false"/>
                 <w:u w:val="none"/>
+                <w:strike w:val="false"/>
                 <w:sz w:val="22"/>
                 <w:szCs w:val="22"/>
                 <w:color w:val="000000"/>
@@ -654,6 +687,7 @@
                 <w:i w:val="false"/>
                 <w:b w:val="false"/>
                 <w:u w:val="none"/>
+                <w:strike w:val="false"/>
                 <w:sz w:val="22"/>
                 <w:szCs w:val="22"/>
                 <w:color w:val="000000"/>
@@ -681,6 +715,7 @@
           </w:tcPr>
           <w:p>
             <w:pPr>
+              <w:pStyle w:val="Normal"/>
               <w:jc w:val="left"/>
               <w:pBdr>
                 <w:bottom w:val="none" w:sz="0" w:space="0" w:color="000000"/>
@@ -695,6 +730,7 @@
                 <w:i w:val="false"/>
                 <w:b w:val="false"/>
                 <w:u w:val="none"/>
+                <w:strike w:val="false"/>
                 <w:sz w:val="22"/>
                 <w:szCs w:val="22"/>
                 <w:color w:val="000000"/>
@@ -706,6 +742,7 @@
                 <w:i w:val="false"/>
                 <w:b w:val="false"/>
                 <w:u w:val="none"/>
+                <w:strike w:val="false"/>
                 <w:sz w:val="22"/>
                 <w:szCs w:val="22"/>
                 <w:color w:val="000000"/>
@@ -733,6 +770,7 @@
           </w:tcPr>
           <w:p>
             <w:pPr>
+              <w:pStyle w:val="Normal"/>
               <w:jc w:val="left"/>
               <w:pBdr>
                 <w:bottom w:val="none" w:sz="0" w:space="0" w:color="000000"/>
@@ -747,6 +785,7 @@
                 <w:i w:val="false"/>
                 <w:b w:val="false"/>
                 <w:u w:val="none"/>
+                <w:strike w:val="false"/>
                 <w:sz w:val="22"/>
                 <w:szCs w:val="22"/>
                 <w:color w:val="000000"/>
@@ -758,6 +797,7 @@
                 <w:i w:val="false"/>
                 <w:b w:val="false"/>
                 <w:u w:val="none"/>
+                <w:strike w:val="false"/>
                 <w:sz w:val="22"/>
                 <w:szCs w:val="22"/>
                 <w:color w:val="000000"/>
@@ -771,7 +811,6 @@
         <w:trPr>
           <w:trHeight w:val="638" w:hRule="auto"/>
         </w:trPr>
-        body2
         <w:tc>
           <w:tcPr>
             <w:tcBorders>
@@ -791,6 +830,7 @@
           </w:tcPr>
           <w:p>
             <w:pPr>
+              <w:pStyle w:val="Normal"/>
               <w:jc w:val="left"/>
               <w:pBdr>
                 <w:bottom w:val="none" w:sz="0" w:space="0" w:color="000000"/>
@@ -805,6 +845,7 @@
                 <w:i w:val="false"/>
                 <w:b w:val="false"/>
                 <w:u w:val="none"/>
+                <w:strike w:val="false"/>
                 <w:sz w:val="22"/>
                 <w:szCs w:val="22"/>
                 <w:color w:val="000000"/>
@@ -816,6 +857,7 @@
                 <w:i w:val="false"/>
                 <w:b w:val="false"/>
                 <w:u w:val="none"/>
+                <w:strike w:val="false"/>
                 <w:sz w:val="24"/>
                 <w:szCs w:val="24"/>
                 <w:color w:val="000000"/>
@@ -843,6 +885,7 @@
           </w:tcPr>
           <w:p>
             <w:pPr>
+              <w:pStyle w:val="Normal"/>
               <w:jc w:val="left"/>
               <w:pBdr>
                 <w:bottom w:val="none" w:sz="0" w:space="0" w:color="000000"/>
@@ -857,6 +900,7 @@
                 <w:i w:val="false"/>
                 <w:b w:val="false"/>
                 <w:u w:val="none"/>
+                <w:strike w:val="false"/>
                 <w:sz w:val="22"/>
                 <w:szCs w:val="22"/>
                 <w:color w:val="000000"/>
@@ -868,6 +912,7 @@
                 <w:i w:val="false"/>
                 <w:b w:val="false"/>
                 <w:u w:val="none"/>
+                <w:strike w:val="false"/>
                 <w:sz w:val="22"/>
                 <w:szCs w:val="22"/>
                 <w:color w:val="000000"/>
@@ -895,6 +940,7 @@
           </w:tcPr>
           <w:p>
             <w:pPr>
+              <w:pStyle w:val="Normal"/>
               <w:jc w:val="left"/>
               <w:pBdr>
                 <w:bottom w:val="none" w:sz="0" w:space="0" w:color="000000"/>
@@ -909,6 +955,7 @@
                 <w:i w:val="false"/>
                 <w:b w:val="false"/>
                 <w:u w:val="none"/>
+                <w:strike w:val="false"/>
                 <w:sz w:val="22"/>
                 <w:szCs w:val="22"/>
                 <w:color w:val="000000"/>
@@ -920,6 +967,7 @@
                 <w:i w:val="false"/>
                 <w:b w:val="false"/>
                 <w:u w:val="none"/>
+                <w:strike w:val="false"/>
                 <w:sz w:val="22"/>
                 <w:szCs w:val="22"/>
                 <w:color w:val="000000"/>
@@ -947,6 +995,7 @@
           </w:tcPr>
           <w:p>
             <w:pPr>
+              <w:pStyle w:val="Normal"/>
               <w:jc w:val="left"/>
               <w:pBdr>
                 <w:bottom w:val="none" w:sz="0" w:space="0" w:color="000000"/>
@@ -961,6 +1010,7 @@
                 <w:i w:val="false"/>
                 <w:b w:val="false"/>
                 <w:u w:val="none"/>
+                <w:strike w:val="false"/>
                 <w:sz w:val="22"/>
                 <w:szCs w:val="22"/>
                 <w:color w:val="000000"/>
@@ -972,6 +1022,7 @@
                 <w:i w:val="false"/>
                 <w:b w:val="false"/>
                 <w:u w:val="none"/>
+                <w:strike w:val="false"/>
                 <w:sz w:val="22"/>
                 <w:szCs w:val="22"/>
                 <w:color w:val="000000"/>
@@ -999,6 +1050,7 @@
           </w:tcPr>
           <w:p>
             <w:pPr>
+              <w:pStyle w:val="Normal"/>
               <w:jc w:val="left"/>
               <w:pBdr>
                 <w:bottom w:val="none" w:sz="0" w:space="0" w:color="000000"/>
@@ -1013,6 +1065,7 @@
                 <w:i w:val="false"/>
                 <w:b w:val="false"/>
                 <w:u w:val="none"/>
+                <w:strike w:val="false"/>
                 <w:sz w:val="22"/>
                 <w:szCs w:val="22"/>
                 <w:color w:val="000000"/>
@@ -1024,6 +1077,7 @@
                 <w:i w:val="false"/>
                 <w:b w:val="false"/>
                 <w:u w:val="none"/>
+                <w:strike w:val="false"/>
                 <w:sz w:val="22"/>
                 <w:szCs w:val="22"/>
                 <w:color w:val="000000"/>
@@ -1051,6 +1105,7 @@
           </w:tcPr>
           <w:p>
             <w:pPr>
+              <w:pStyle w:val="Normal"/>
               <w:jc w:val="left"/>
               <w:pBdr>
                 <w:bottom w:val="none" w:sz="0" w:space="0" w:color="000000"/>
@@ -1065,6 +1120,7 @@
                 <w:i w:val="false"/>
                 <w:b w:val="false"/>
                 <w:u w:val="none"/>
+                <w:strike w:val="false"/>
                 <w:sz w:val="22"/>
                 <w:szCs w:val="22"/>
                 <w:color w:val="000000"/>
@@ -1076,6 +1132,7 @@
                 <w:i w:val="false"/>
                 <w:b w:val="false"/>
                 <w:u w:val="none"/>
+                <w:strike w:val="false"/>
                 <w:sz w:val="22"/>
                 <w:szCs w:val="22"/>
                 <w:color w:val="000000"/>
@@ -1103,6 +1160,7 @@
           </w:tcPr>
           <w:p>
             <w:pPr>
+              <w:pStyle w:val="Normal"/>
               <w:jc w:val="left"/>
               <w:pBdr>
                 <w:bottom w:val="none" w:sz="0" w:space="0" w:color="000000"/>
@@ -1117,6 +1175,7 @@
                 <w:i w:val="false"/>
                 <w:b w:val="false"/>
                 <w:u w:val="none"/>
+                <w:strike w:val="false"/>
                 <w:sz w:val="22"/>
                 <w:szCs w:val="22"/>
                 <w:color w:val="000000"/>
@@ -1128,6 +1187,7 @@
                 <w:i w:val="false"/>
                 <w:b w:val="false"/>
                 <w:u w:val="none"/>
+                <w:strike w:val="false"/>
                 <w:sz w:val="22"/>
                 <w:szCs w:val="22"/>
                 <w:color w:val="000000"/>
@@ -1141,7 +1201,6 @@
         <w:trPr>
           <w:trHeight w:val="641" w:hRule="auto"/>
         </w:trPr>
-        body3
         <w:tc>
           <w:tcPr>
             <w:tcBorders>
@@ -1161,6 +1220,7 @@
           </w:tcPr>
           <w:p>
             <w:pPr>
+              <w:pStyle w:val="Normal"/>
               <w:jc w:val="left"/>
               <w:pBdr>
                 <w:bottom w:val="none" w:sz="0" w:space="0" w:color="000000"/>
@@ -1175,6 +1235,7 @@
                 <w:i w:val="false"/>
                 <w:b w:val="false"/>
                 <w:u w:val="none"/>
+                <w:strike w:val="false"/>
                 <w:sz w:val="22"/>
                 <w:szCs w:val="22"/>
                 <w:color w:val="000000"/>
@@ -1186,6 +1247,7 @@
                 <w:i w:val="false"/>
                 <w:b w:val="false"/>
                 <w:u w:val="none"/>
+                <w:strike w:val="false"/>
                 <w:sz w:val="24"/>
                 <w:szCs w:val="24"/>
                 <w:color w:val="000000"/>
@@ -1213,6 +1275,7 @@
           </w:tcPr>
           <w:p>
             <w:pPr>
+              <w:pStyle w:val="Normal"/>
               <w:jc w:val="left"/>
               <w:pBdr>
                 <w:bottom w:val="none" w:sz="0" w:space="0" w:color="000000"/>
@@ -1227,6 +1290,7 @@
                 <w:i w:val="false"/>
                 <w:b w:val="false"/>
                 <w:u w:val="none"/>
+                <w:strike w:val="false"/>
                 <w:sz w:val="22"/>
                 <w:szCs w:val="22"/>
                 <w:color w:val="000000"/>
@@ -1238,6 +1302,7 @@
                 <w:i w:val="false"/>
                 <w:b w:val="false"/>
                 <w:u w:val="none"/>
+                <w:strike w:val="false"/>
                 <w:sz w:val="22"/>
                 <w:szCs w:val="22"/>
                 <w:color w:val="000000"/>
@@ -1265,6 +1330,7 @@
           </w:tcPr>
           <w:p>
             <w:pPr>
+              <w:pStyle w:val="Normal"/>
               <w:jc w:val="left"/>
               <w:pBdr>
                 <w:bottom w:val="none" w:sz="0" w:space="0" w:color="000000"/>
@@ -1279,6 +1345,7 @@
                 <w:i w:val="false"/>
                 <w:b w:val="false"/>
                 <w:u w:val="none"/>
+                <w:strike w:val="false"/>
                 <w:sz w:val="22"/>
                 <w:szCs w:val="22"/>
                 <w:color w:val="000000"/>
@@ -1290,6 +1357,7 @@
                 <w:i w:val="false"/>
                 <w:b w:val="false"/>
                 <w:u w:val="none"/>
+                <w:strike w:val="false"/>
                 <w:sz w:val="22"/>
                 <w:szCs w:val="22"/>
                 <w:color w:val="000000"/>
@@ -1317,6 +1385,7 @@
           </w:tcPr>
           <w:p>
             <w:pPr>
+              <w:pStyle w:val="Normal"/>
               <w:jc w:val="left"/>
               <w:pBdr>
                 <w:bottom w:val="none" w:sz="0" w:space="0" w:color="000000"/>
@@ -1331,6 +1400,7 @@
                 <w:i w:val="false"/>
                 <w:b w:val="false"/>
                 <w:u w:val="none"/>
+                <w:strike w:val="false"/>
                 <w:sz w:val="22"/>
                 <w:szCs w:val="22"/>
                 <w:color w:val="000000"/>
@@ -1342,6 +1412,7 @@
                 <w:i w:val="false"/>
                 <w:b w:val="false"/>
                 <w:u w:val="none"/>
+                <w:strike w:val="false"/>
                 <w:sz w:val="22"/>
                 <w:szCs w:val="22"/>
                 <w:color w:val="000000"/>
@@ -1369,6 +1440,7 @@
           </w:tcPr>
           <w:p>
             <w:pPr>
+              <w:pStyle w:val="Normal"/>
               <w:jc w:val="left"/>
               <w:pBdr>
                 <w:bottom w:val="none" w:sz="0" w:space="0" w:color="000000"/>
@@ -1383,6 +1455,7 @@
                 <w:i w:val="false"/>
                 <w:b w:val="false"/>
                 <w:u w:val="none"/>
+                <w:strike w:val="false"/>
                 <w:sz w:val="22"/>
                 <w:szCs w:val="22"/>
                 <w:color w:val="000000"/>
@@ -1394,6 +1467,7 @@
                 <w:i w:val="false"/>
                 <w:b w:val="false"/>
                 <w:u w:val="none"/>
+                <w:strike w:val="false"/>
                 <w:sz w:val="22"/>
                 <w:szCs w:val="22"/>
                 <w:color w:val="000000"/>
@@ -1421,6 +1495,7 @@
           </w:tcPr>
           <w:p>
             <w:pPr>
+              <w:pStyle w:val="Normal"/>
               <w:jc w:val="left"/>
               <w:pBdr>
                 <w:bottom w:val="none" w:sz="0" w:space="0" w:color="000000"/>
@@ -1435,6 +1510,7 @@
                 <w:i w:val="false"/>
                 <w:b w:val="false"/>
                 <w:u w:val="none"/>
+                <w:strike w:val="false"/>
                 <w:sz w:val="22"/>
                 <w:szCs w:val="22"/>
                 <w:color w:val="000000"/>
@@ -1446,6 +1522,7 @@
                 <w:i w:val="false"/>
                 <w:b w:val="false"/>
                 <w:u w:val="none"/>
+                <w:strike w:val="false"/>
                 <w:sz w:val="22"/>
                 <w:szCs w:val="22"/>
                 <w:color w:val="000000"/>
@@ -1473,6 +1550,7 @@
           </w:tcPr>
           <w:p>
             <w:pPr>
+              <w:pStyle w:val="Normal"/>
               <w:jc w:val="left"/>
               <w:pBdr>
                 <w:bottom w:val="none" w:sz="0" w:space="0" w:color="000000"/>
@@ -1487,6 +1565,7 @@
                 <w:i w:val="false"/>
                 <w:b w:val="false"/>
                 <w:u w:val="none"/>
+                <w:strike w:val="false"/>
                 <w:sz w:val="22"/>
                 <w:szCs w:val="22"/>
                 <w:color w:val="000000"/>
@@ -1498,6 +1577,7 @@
                 <w:i w:val="false"/>
                 <w:b w:val="false"/>
                 <w:u w:val="none"/>
+                <w:strike w:val="false"/>
                 <w:sz w:val="22"/>
                 <w:szCs w:val="22"/>
                 <w:color w:val="000000"/>
@@ -1511,7 +1591,6 @@
         <w:trPr>
           <w:trHeight w:val="577" w:hRule="auto"/>
         </w:trPr>
-        body4
         <w:tc>
           <w:tcPr>
             <w:tcBorders>
@@ -1531,6 +1610,7 @@
           </w:tcPr>
           <w:p>
             <w:pPr>
+              <w:pStyle w:val="Normal"/>
               <w:jc w:val="left"/>
               <w:pBdr>
                 <w:bottom w:val="none" w:sz="0" w:space="0" w:color="000000"/>
@@ -1545,6 +1625,7 @@
                 <w:i w:val="false"/>
                 <w:b w:val="false"/>
                 <w:u w:val="none"/>
+                <w:strike w:val="false"/>
                 <w:sz w:val="22"/>
                 <w:szCs w:val="22"/>
                 <w:color w:val="000000"/>
@@ -1556,6 +1637,7 @@
                 <w:i w:val="false"/>
                 <w:b w:val="false"/>
                 <w:u w:val="none"/>
+                <w:strike w:val="false"/>
                 <w:sz w:val="24"/>
                 <w:szCs w:val="24"/>
                 <w:color w:val="000000"/>
@@ -1583,6 +1665,7 @@
           </w:tcPr>
           <w:p>
             <w:pPr>
+              <w:pStyle w:val="Normal"/>
               <w:jc w:val="left"/>
               <w:pBdr>
                 <w:bottom w:val="none" w:sz="0" w:space="0" w:color="000000"/>
@@ -1597,6 +1680,7 @@
                 <w:i w:val="false"/>
                 <w:b w:val="false"/>
                 <w:u w:val="none"/>
+                <w:strike w:val="false"/>
                 <w:sz w:val="22"/>
                 <w:szCs w:val="22"/>
                 <w:color w:val="000000"/>
@@ -1608,6 +1692,7 @@
                 <w:i w:val="false"/>
                 <w:b w:val="false"/>
                 <w:u w:val="none"/>
+                <w:strike w:val="false"/>
                 <w:sz w:val="22"/>
                 <w:szCs w:val="22"/>
                 <w:color w:val="000000"/>
@@ -1635,6 +1720,7 @@
           </w:tcPr>
           <w:p>
             <w:pPr>
+              <w:pStyle w:val="Normal"/>
               <w:jc w:val="left"/>
               <w:pBdr>
                 <w:bottom w:val="none" w:sz="0" w:space="0" w:color="000000"/>
@@ -1649,6 +1735,7 @@
                 <w:i w:val="false"/>
                 <w:b w:val="false"/>
                 <w:u w:val="none"/>
+                <w:strike w:val="false"/>
                 <w:sz w:val="22"/>
                 <w:szCs w:val="22"/>
                 <w:color w:val="000000"/>
@@ -1660,6 +1747,7 @@
                 <w:i w:val="false"/>
                 <w:b w:val="false"/>
                 <w:u w:val="none"/>
+                <w:strike w:val="false"/>
                 <w:sz w:val="22"/>
                 <w:szCs w:val="22"/>
                 <w:color w:val="000000"/>
@@ -1687,6 +1775,7 @@
           </w:tcPr>
           <w:p>
             <w:pPr>
+              <w:pStyle w:val="Normal"/>
               <w:jc w:val="left"/>
               <w:pBdr>
                 <w:bottom w:val="none" w:sz="0" w:space="0" w:color="000000"/>
@@ -1701,6 +1790,7 @@
                 <w:i w:val="false"/>
                 <w:b w:val="false"/>
                 <w:u w:val="none"/>
+                <w:strike w:val="false"/>
                 <w:sz w:val="22"/>
                 <w:szCs w:val="22"/>
                 <w:color w:val="000000"/>
@@ -1712,6 +1802,7 @@
                 <w:i w:val="false"/>
                 <w:b w:val="false"/>
                 <w:u w:val="none"/>
+                <w:strike w:val="false"/>
                 <w:sz w:val="22"/>
                 <w:szCs w:val="22"/>
                 <w:color w:val="000000"/>
@@ -1739,6 +1830,7 @@
           </w:tcPr>
           <w:p>
             <w:pPr>
+              <w:pStyle w:val="Normal"/>
               <w:jc w:val="left"/>
               <w:pBdr>
                 <w:bottom w:val="none" w:sz="0" w:space="0" w:color="000000"/>
@@ -1753,6 +1845,7 @@
                 <w:i w:val="false"/>
                 <w:b w:val="false"/>
                 <w:u w:val="none"/>
+                <w:strike w:val="false"/>
                 <w:sz w:val="22"/>
                 <w:szCs w:val="22"/>
                 <w:color w:val="000000"/>
@@ -1764,6 +1857,7 @@
                 <w:i w:val="false"/>
                 <w:b w:val="false"/>
                 <w:u w:val="none"/>
+                <w:strike w:val="false"/>
                 <w:sz w:val="22"/>
                 <w:szCs w:val="22"/>
                 <w:color w:val="000000"/>
@@ -1791,6 +1885,7 @@
           </w:tcPr>
           <w:p>
             <w:pPr>
+              <w:pStyle w:val="Normal"/>
               <w:jc w:val="left"/>
               <w:pBdr>
                 <w:bottom w:val="none" w:sz="0" w:space="0" w:color="000000"/>
@@ -1805,6 +1900,7 @@
                 <w:i w:val="false"/>
                 <w:b w:val="false"/>
                 <w:u w:val="none"/>
+                <w:strike w:val="false"/>
                 <w:sz w:val="22"/>
                 <w:szCs w:val="22"/>
                 <w:color w:val="000000"/>
@@ -1816,6 +1912,7 @@
                 <w:i w:val="false"/>
                 <w:b w:val="false"/>
                 <w:u w:val="none"/>
+                <w:strike w:val="false"/>
                 <w:sz w:val="22"/>
                 <w:szCs w:val="22"/>
                 <w:color w:val="000000"/>
@@ -1843,6 +1940,7 @@
           </w:tcPr>
           <w:p>
             <w:pPr>
+              <w:pStyle w:val="Normal"/>
               <w:jc w:val="left"/>
               <w:pBdr>
                 <w:bottom w:val="none" w:sz="0" w:space="0" w:color="000000"/>
@@ -1857,6 +1955,7 @@
                 <w:i w:val="false"/>
                 <w:b w:val="false"/>
                 <w:u w:val="none"/>
+                <w:strike w:val="false"/>
                 <w:sz w:val="22"/>
                 <w:szCs w:val="22"/>
                 <w:color w:val="000000"/>
@@ -1868,6 +1967,7 @@
                 <w:i w:val="false"/>
                 <w:b w:val="false"/>
                 <w:u w:val="none"/>
+                <w:strike w:val="false"/>
                 <w:sz w:val="22"/>
                 <w:szCs w:val="22"/>
                 <w:color w:val="000000"/>
@@ -1881,7 +1981,6 @@
         <w:trPr>
           <w:trHeight w:val="591" w:hRule="auto"/>
         </w:trPr>
-        body5
         <w:tc>
           <w:tcPr>
             <w:tcBorders>
@@ -1901,6 +2000,7 @@
           </w:tcPr>
           <w:p>
             <w:pPr>
+              <w:pStyle w:val="Normal"/>
               <w:jc w:val="left"/>
               <w:pBdr>
                 <w:bottom w:val="none" w:sz="0" w:space="0" w:color="000000"/>
@@ -1915,6 +2015,7 @@
                 <w:i w:val="false"/>
                 <w:b w:val="false"/>
                 <w:u w:val="none"/>
+                <w:strike w:val="false"/>
                 <w:sz w:val="22"/>
                 <w:szCs w:val="22"/>
                 <w:color w:val="000000"/>
@@ -1926,6 +2027,7 @@
                 <w:i w:val="false"/>
                 <w:b w:val="false"/>
                 <w:u w:val="none"/>
+                <w:strike w:val="false"/>
                 <w:sz w:val="24"/>
                 <w:szCs w:val="24"/>
                 <w:color w:val="000000"/>
@@ -1953,6 +2055,7 @@
           </w:tcPr>
           <w:p>
             <w:pPr>
+              <w:pStyle w:val="Normal"/>
               <w:jc w:val="left"/>
               <w:pBdr>
                 <w:bottom w:val="none" w:sz="0" w:space="0" w:color="000000"/>
@@ -1967,6 +2070,7 @@
                 <w:i w:val="false"/>
                 <w:b w:val="false"/>
                 <w:u w:val="none"/>
+                <w:strike w:val="false"/>
                 <w:sz w:val="22"/>
                 <w:szCs w:val="22"/>
                 <w:color w:val="000000"/>
@@ -1978,6 +2082,7 @@
                 <w:i w:val="false"/>
                 <w:b w:val="false"/>
                 <w:u w:val="none"/>
+                <w:strike w:val="false"/>
                 <w:sz w:val="22"/>
                 <w:szCs w:val="22"/>
                 <w:color w:val="000000"/>
@@ -2005,6 +2110,7 @@
           </w:tcPr>
           <w:p>
             <w:pPr>
+              <w:pStyle w:val="Normal"/>
               <w:jc w:val="left"/>
               <w:pBdr>
                 <w:bottom w:val="none" w:sz="0" w:space="0" w:color="000000"/>
@@ -2019,6 +2125,7 @@
                 <w:i w:val="false"/>
                 <w:b w:val="false"/>
                 <w:u w:val="none"/>
+                <w:strike w:val="false"/>
                 <w:sz w:val="22"/>
                 <w:szCs w:val="22"/>
                 <w:color w:val="000000"/>
@@ -2030,6 +2137,7 @@
                 <w:i w:val="false"/>
                 <w:b w:val="false"/>
                 <w:u w:val="none"/>
+                <w:strike w:val="false"/>
                 <w:sz w:val="22"/>
                 <w:szCs w:val="22"/>
                 <w:color w:val="000000"/>
@@ -2057,6 +2165,7 @@
           </w:tcPr>
           <w:p>
             <w:pPr>
+              <w:pStyle w:val="Normal"/>
               <w:jc w:val="left"/>
               <w:pBdr>
                 <w:bottom w:val="none" w:sz="0" w:space="0" w:color="000000"/>
@@ -2071,6 +2180,7 @@
                 <w:i w:val="false"/>
                 <w:b w:val="false"/>
                 <w:u w:val="none"/>
+                <w:strike w:val="false"/>
                 <w:sz w:val="22"/>
                 <w:szCs w:val="22"/>
                 <w:color w:val="000000"/>
@@ -2082,6 +2192,7 @@
                 <w:i w:val="false"/>
                 <w:b w:val="false"/>
                 <w:u w:val="none"/>
+                <w:strike w:val="false"/>
                 <w:sz w:val="22"/>
                 <w:szCs w:val="22"/>
                 <w:color w:val="000000"/>
@@ -2109,6 +2220,7 @@
           </w:tcPr>
           <w:p>
             <w:pPr>
+              <w:pStyle w:val="Normal"/>
               <w:jc w:val="left"/>
               <w:pBdr>
                 <w:bottom w:val="none" w:sz="0" w:space="0" w:color="000000"/>
@@ -2123,6 +2235,7 @@
                 <w:i w:val="false"/>
                 <w:b w:val="false"/>
                 <w:u w:val="none"/>
+                <w:strike w:val="false"/>
                 <w:sz w:val="22"/>
                 <w:szCs w:val="22"/>
                 <w:color w:val="000000"/>
@@ -2134,6 +2247,7 @@
                 <w:i w:val="false"/>
                 <w:b w:val="false"/>
                 <w:u w:val="none"/>
+                <w:strike w:val="false"/>
                 <w:sz w:val="22"/>
                 <w:szCs w:val="22"/>
                 <w:color w:val="000000"/>
@@ -2161,6 +2275,7 @@
           </w:tcPr>
           <w:p>
             <w:pPr>
+              <w:pStyle w:val="Normal"/>
               <w:jc w:val="left"/>
               <w:pBdr>
                 <w:bottom w:val="none" w:sz="0" w:space="0" w:color="000000"/>
@@ -2175,6 +2290,7 @@
                 <w:i w:val="false"/>
                 <w:b w:val="false"/>
                 <w:u w:val="none"/>
+                <w:strike w:val="false"/>
                 <w:sz w:val="22"/>
                 <w:szCs w:val="22"/>
                 <w:color w:val="000000"/>
@@ -2186,6 +2302,7 @@
                 <w:i w:val="false"/>
                 <w:b w:val="false"/>
                 <w:u w:val="none"/>
+                <w:strike w:val="false"/>
                 <w:sz w:val="22"/>
                 <w:szCs w:val="22"/>
                 <w:color w:val="000000"/>
@@ -2213,6 +2330,7 @@
           </w:tcPr>
           <w:p>
             <w:pPr>
+              <w:pStyle w:val="Normal"/>
               <w:jc w:val="left"/>
               <w:pBdr>
                 <w:bottom w:val="none" w:sz="0" w:space="0" w:color="000000"/>
@@ -2227,6 +2345,7 @@
                 <w:i w:val="false"/>
                 <w:b w:val="false"/>
                 <w:u w:val="none"/>
+                <w:strike w:val="false"/>
                 <w:sz w:val="22"/>
                 <w:szCs w:val="22"/>
                 <w:color w:val="000000"/>
@@ -2238,6 +2357,7 @@
                 <w:i w:val="false"/>
                 <w:b w:val="false"/>
                 <w:u w:val="none"/>
+                <w:strike w:val="false"/>
                 <w:sz w:val="22"/>
                 <w:szCs w:val="22"/>
                 <w:color w:val="000000"/>
@@ -2255,10 +2375,11 @@
       <w:r>
         <w:rPr>
           <w:rFonts/>
+          <w:strike w:val="false"/>
         </w:rPr>
         <w:t xml:space="preserve">Table </w:t>
       </w:r>
-      <w:bookmarkStart w:id="b417ee6c-0459-4bd3-ac50-fab41ffc0aae" w:name="pest_table"/>
+      <w:bookmarkStart w:id="52e2569b-7b3b-43c2-8d1d-d7f1199957ea" w:name="pest_table"/>
       <w:r>
         <w:rPr/>
         <w:t xml:space="preserve"/>
@@ -2279,16 +2400,18 @@
         <w:rPr/>
         <w:t xml:space="preserve"/>
       </w:r>
-      <w:bookmarkEnd w:id="b417ee6c-0459-4bd3-ac50-fab41ffc0aae"/>
+      <w:bookmarkEnd w:id="52e2569b-7b3b-43c2-8d1d-d7f1199957ea"/>
       <w:r>
         <w:rPr>
           <w:rFonts/>
+          <w:strike w:val="false"/>
         </w:rPr>
         <w:t xml:space="preserve">. </w:t>
       </w:r>
       <w:r>
         <w:rPr>
           <w:rFonts/>
+          <w:strike w:val="false"/>
         </w:rPr>
         <w:t xml:space="preserve">Parameter Estimates</w:t>
       </w:r>
@@ -2348,7 +2471,7 @@
                   <pic:spPr bwMode="auto">
                     <a:xfrm>
                       <a:off x="0" y="0"/>
-                      <a:ext cx="101600" cy="53340"/>
+                      <a:ext cx="7315200" cy="3840480"/>
                     </a:xfrm>
                     <a:prstGeom prst="rect">
                       <a:avLst/>
@@ -2369,10 +2492,11 @@
       <w:r>
         <w:rPr>
           <w:rFonts/>
+          <w:strike w:val="false"/>
         </w:rPr>
         <w:t xml:space="preserve">Figure </w:t>
       </w:r>
-      <w:bookmarkStart w:id="499dffe3-96a8-40a4-984b-c582f8486df0" w:name="ind_plots"/>
+      <w:bookmarkStart w:id="e4efdaf9-1c19-43ec-9a72-ef32f36aa0cd" w:name="ind_plots"/>
       <w:r>
         <w:rPr/>
         <w:t xml:space="preserve"/>
@@ -2393,16 +2517,18 @@
         <w:rPr/>
         <w:t xml:space="preserve"/>
       </w:r>
-      <w:bookmarkEnd w:id="499dffe3-96a8-40a4-984b-c582f8486df0"/>
+      <w:bookmarkEnd w:id="e4efdaf9-1c19-43ec-9a72-ef32f36aa0cd"/>
       <w:r>
         <w:rPr>
           <w:rFonts/>
+          <w:strike w:val="false"/>
         </w:rPr>
         <w:t xml:space="preserve">. </w:t>
       </w:r>
       <w:r>
         <w:rPr>
           <w:rFonts/>
+          <w:strike w:val="false"/>
         </w:rPr>
         <w:t xml:space="preserve">Individual and population prediction overlay</w:t>
       </w:r>
@@ -2448,7 +2574,7 @@
                   <pic:spPr bwMode="auto">
                     <a:xfrm>
                       <a:off x="0" y="0"/>
-                      <a:ext cx="82550" cy="76200"/>
+                      <a:ext cx="5943600" cy="5486400"/>
                     </a:xfrm>
                     <a:prstGeom prst="rect">
                       <a:avLst/>
@@ -2469,10 +2595,11 @@
       <w:r>
         <w:rPr>
           <w:rFonts/>
+          <w:strike w:val="false"/>
         </w:rPr>
         <w:t xml:space="preserve">Figure </w:t>
       </w:r>
-      <w:bookmarkStart w:id="316b7191-3473-45f5-a237-384c58b5ddf2" w:name="dv_vs_pred_ipred"/>
+      <w:bookmarkStart w:id="6d407b34-58d4-4c79-97df-65cc8df28ce9" w:name="dv_vs_pred_ipred"/>
       <w:r>
         <w:rPr/>
         <w:t xml:space="preserve"/>
@@ -2493,16 +2620,18 @@
         <w:rPr/>
         <w:t xml:space="preserve"/>
       </w:r>
-      <w:bookmarkEnd w:id="316b7191-3473-45f5-a237-384c58b5ddf2"/>
+      <w:bookmarkEnd w:id="6d407b34-58d4-4c79-97df-65cc8df28ce9"/>
       <w:r>
         <w:rPr>
           <w:rFonts/>
+          <w:strike w:val="false"/>
         </w:rPr>
         <w:t xml:space="preserve">. </w:t>
       </w:r>
       <w:r>
         <w:rPr>
           <w:rFonts/>
+          <w:strike w:val="false"/>
         </w:rPr>
         <w:t xml:space="preserve">Observed vs Predicted</w:t>
       </w:r>
@@ -2554,7 +2683,7 @@
                   <pic:spPr bwMode="auto">
                     <a:xfrm>
                       <a:off x="0" y="0"/>
-                      <a:ext cx="101600" cy="53340"/>
+                      <a:ext cx="7315200" cy="3840480"/>
                     </a:xfrm>
                     <a:prstGeom prst="rect">
                       <a:avLst/>
@@ -2575,10 +2704,11 @@
       <w:r>
         <w:rPr>
           <w:rFonts/>
+          <w:strike w:val="false"/>
         </w:rPr>
         <w:t xml:space="preserve">Figure </w:t>
       </w:r>
-      <w:bookmarkStart w:id="5df40b1e-0c18-49f1-b21f-28a7fa5865d2" w:name="prm_vs_iteration"/>
+      <w:bookmarkStart w:id="0b1dbc28-d0c5-48b0-81b9-e76016c996a8" w:name="prm_vs_iteration"/>
       <w:r>
         <w:rPr/>
         <w:t xml:space="preserve"/>
@@ -2599,16 +2729,18 @@
         <w:rPr/>
         <w:t xml:space="preserve"/>
       </w:r>
-      <w:bookmarkEnd w:id="5df40b1e-0c18-49f1-b21f-28a7fa5865d2"/>
+      <w:bookmarkEnd w:id="0b1dbc28-d0c5-48b0-81b9-e76016c996a8"/>
       <w:r>
         <w:rPr>
           <w:rFonts/>
+          <w:strike w:val="false"/>
         </w:rPr>
         <w:t xml:space="preserve">. </w:t>
       </w:r>
       <w:r>
         <w:rPr>
           <w:rFonts/>
+          <w:strike w:val="false"/>
         </w:rPr>
         <w:t xml:space="preserve">SAEM Stabilization</w:t>
       </w:r>

</xml_diff>

<commit_message>
Deploying to gh-pages from @ nlmixr2/monolix2rx@99c640b21d3cee9ed75bcdf0442053b6bc7b2df3 🚀
</commit_message>
<xml_diff>
--- a/articles/mod-Word.docx
+++ b/articles/mod-Word.docx
@@ -19,16 +19,16 @@
       </w:tblPr>
       <w:tblGrid>
         <w:gridCol w:w="1565"/>
-        <w:gridCol w:w="1180"/>
-        <w:gridCol w:w="1180"/>
-        <w:gridCol w:w="1051"/>
-        <w:gridCol w:w="3261"/>
+        <w:gridCol w:w="1320"/>
+        <w:gridCol w:w="1675"/>
+        <w:gridCol w:w="1675"/>
+        <w:gridCol w:w="3521"/>
         <w:gridCol w:w="1537"/>
         <w:gridCol w:w="1798"/>
       </w:tblGrid>
       <w:tr>
         <w:trPr>
-          <w:trHeight w:val="607" w:hRule="auto"/>
+          <w:trHeight w:val="638" w:hRule="auto"/>
           <w:tblHeader/>
         </w:trPr>
         <w:tc>
@@ -419,7 +419,7 @@
       </w:tr>
       <w:tr>
         <w:trPr>
-          <w:trHeight w:val="638" w:hRule="auto"/>
+          <w:trHeight w:val="632" w:hRule="auto"/>
         </w:trPr>
         <w:tc>
           <w:tcPr>
@@ -527,7 +527,7 @@
                 <w:szCs w:val="22"/>
                 <w:color w:val="000000"/>
               </w:rPr>
-              <w:t xml:space="preserve">0.427</w:t>
+              <w:t xml:space="preserve">0.4270</w:t>
             </w:r>
           </w:p>
         </w:tc>
@@ -582,7 +582,7 @@
                 <w:szCs w:val="22"/>
                 <w:color w:val="000000"/>
               </w:rPr>
-              <w:t xml:space="preserve">0.204</w:t>
+              <w:t xml:space="preserve">0.2041</w:t>
             </w:r>
           </w:p>
         </w:tc>
@@ -637,7 +637,7 @@
                 <w:szCs w:val="22"/>
                 <w:color w:val="000000"/>
               </w:rPr>
-              <w:t xml:space="preserve">47.8</w:t>
+              <w:t xml:space="preserve">47.80</w:t>
             </w:r>
           </w:p>
         </w:tc>
@@ -692,7 +692,7 @@
                 <w:szCs w:val="22"/>
                 <w:color w:val="000000"/>
               </w:rPr>
-              <w:t xml:space="preserve">1.53 (1.03, 2.29)</w:t>
+              <w:t xml:space="preserve">1.533 (1.027, 2.286)</w:t>
             </w:r>
           </w:p>
         </w:tc>
@@ -747,7 +747,7 @@
                 <w:szCs w:val="22"/>
                 <w:color w:val="000000"/>
               </w:rPr>
-              <w:t xml:space="preserve">75.4</w:t>
+              <w:t xml:space="preserve">75.42</w:t>
             </w:r>
           </w:p>
         </w:tc>
@@ -802,14 +802,14 @@
                 <w:szCs w:val="22"/>
                 <w:color w:val="000000"/>
               </w:rPr>
-              <w:t xml:space="preserve">1.05%&lt;</w:t>
+              <w:t xml:space="preserve">1.055&lt;</w:t>
             </w:r>
           </w:p>
         </w:tc>
       </w:tr>
       <w:tr>
         <w:trPr>
-          <w:trHeight w:val="638" w:hRule="auto"/>
+          <w:trHeight w:val="632" w:hRule="auto"/>
         </w:trPr>
         <w:tc>
           <w:tcPr>
@@ -917,7 +917,7 @@
                 <w:szCs w:val="22"/>
                 <w:color w:val="000000"/>
               </w:rPr>
-              <w:t xml:space="preserve">-0.786</w:t>
+              <w:t xml:space="preserve">-0.7864</w:t>
             </w:r>
           </w:p>
         </w:tc>
@@ -972,7 +972,7 @@
                 <w:szCs w:val="22"/>
                 <w:color w:val="000000"/>
               </w:rPr>
-              <w:t xml:space="preserve">0.045</w:t>
+              <w:t xml:space="preserve">0.04496</w:t>
             </w:r>
           </w:p>
         </w:tc>
@@ -1027,7 +1027,7 @@
                 <w:szCs w:val="22"/>
                 <w:color w:val="000000"/>
               </w:rPr>
-              <w:t xml:space="preserve">5.72</w:t>
+              <w:t xml:space="preserve">5.717</w:t>
             </w:r>
           </w:p>
         </w:tc>
@@ -1082,7 +1082,7 @@
                 <w:szCs w:val="22"/>
                 <w:color w:val="000000"/>
               </w:rPr>
-              <w:t xml:space="preserve">0.456 (0.417, 0.497)</w:t>
+              <w:t xml:space="preserve">0.4555 (0.4171, 0.4975)</w:t>
             </w:r>
           </w:p>
         </w:tc>
@@ -1137,7 +1137,7 @@
                 <w:szCs w:val="22"/>
                 <w:color w:val="000000"/>
               </w:rPr>
-              <w:t xml:space="preserve">12.7</w:t>
+              <w:t xml:space="preserve">12.68</w:t>
             </w:r>
           </w:p>
         </w:tc>
@@ -1192,14 +1192,14 @@
                 <w:szCs w:val="22"/>
                 <w:color w:val="000000"/>
               </w:rPr>
-              <w:t xml:space="preserve">13.3%&lt;</w:t>
+              <w:t xml:space="preserve">13.29&lt;</w:t>
             </w:r>
           </w:p>
         </w:tc>
       </w:tr>
       <w:tr>
         <w:trPr>
-          <w:trHeight w:val="641" w:hRule="auto"/>
+          <w:trHeight w:val="632" w:hRule="auto"/>
         </w:trPr>
         <w:tc>
           <w:tcPr>
@@ -1307,7 +1307,7 @@
                 <w:szCs w:val="22"/>
                 <w:color w:val="000000"/>
               </w:rPr>
-              <w:t xml:space="preserve">-3.21</w:t>
+              <w:t xml:space="preserve">-3.215</w:t>
             </w:r>
           </w:p>
         </w:tc>
@@ -1362,7 +1362,7 @@
                 <w:szCs w:val="22"/>
                 <w:color w:val="000000"/>
               </w:rPr>
-              <w:t xml:space="preserve">0.0837</w:t>
+              <w:t xml:space="preserve">0.08374</w:t>
             </w:r>
           </w:p>
         </w:tc>
@@ -1417,7 +1417,7 @@
                 <w:szCs w:val="22"/>
                 <w:color w:val="000000"/>
               </w:rPr>
-              <w:t xml:space="preserve">2.61</w:t>
+              <w:t xml:space="preserve">2.605</w:t>
             </w:r>
           </w:p>
         </w:tc>
@@ -1472,7 +1472,7 @@
                 <w:szCs w:val="22"/>
                 <w:color w:val="000000"/>
               </w:rPr>
-              <w:t xml:space="preserve">0.0402 (0.0341, 0.0473)</w:t>
+              <w:t xml:space="preserve">0.04017 (0.03409, 0.04734)</w:t>
             </w:r>
           </w:p>
         </w:tc>
@@ -1527,7 +1527,7 @@
                 <w:szCs w:val="22"/>
                 <w:color w:val="000000"/>
               </w:rPr>
-              <w:t xml:space="preserve">27.6</w:t>
+              <w:t xml:space="preserve">27.57</w:t>
             </w:r>
           </w:p>
         </w:tc>
@@ -1582,14 +1582,14 @@
                 <w:szCs w:val="22"/>
                 <w:color w:val="000000"/>
               </w:rPr>
-              <w:t xml:space="preserve">2.65%&lt;</w:t>
+              <w:t xml:space="preserve">2.648&lt;</w:t>
             </w:r>
           </w:p>
         </w:tc>
       </w:tr>
       <w:tr>
         <w:trPr>
-          <w:trHeight w:val="577" w:hRule="auto"/>
+          <w:trHeight w:val="632" w:hRule="auto"/>
         </w:trPr>
         <w:tc>
           <w:tcPr>
@@ -1697,7 +1697,172 @@
                 <w:szCs w:val="22"/>
                 <w:color w:val="000000"/>
               </w:rPr>
-              <w:t xml:space="preserve">0.433</w:t>
+              <w:t xml:space="preserve">0.4333</w:t>
+            </w:r>
+          </w:p>
+        </w:tc>
+        <w:tc>
+          <w:tcPr>
+            <w:tcBorders>
+              <w:bottom w:val="none" w:sz="0" w:space="0" w:color="000000"/>
+              <w:top w:val="none" w:sz="0" w:space="0" w:color="000000"/>
+              <w:left w:val="none" w:sz="0" w:space="0" w:color="000000"/>
+              <w:right w:val="none" w:sz="0" w:space="0" w:color="000000"/>
+            </w:tcBorders>
+            <w:shd w:val="clear" w:color="auto" w:fill="FFFFFF"/>
+            <w:tcMar>
+              <w:top w:w="0" w:type="dxa"/>
+              <w:bottom w:w="0" w:type="dxa"/>
+              <w:left w:w="0" w:type="dxa"/>
+              <w:right w:w="0" w:type="dxa"/>
+            </w:tcMar>
+            <w:vAlign w:val="center"/>
+          </w:tcPr>
+          <w:p>
+            <w:pPr>
+              <w:pStyle w:val="Normal"/>
+              <w:jc w:val="left"/>
+              <w:pBdr>
+                <w:bottom w:val="none" w:sz="0" w:space="0" w:color="000000"/>
+                <w:top w:val="none" w:sz="0" w:space="0" w:color="000000"/>
+                <w:left w:val="none" w:sz="0" w:space="0" w:color="000000"/>
+                <w:right w:val="none" w:sz="0" w:space="0" w:color="000000"/>
+              </w:pBdr>
+              <w:spacing w:after="100" w:before="100" w:line="240"/>
+              <w:ind w:left="100" w:right="100" w:firstLine="0" w:firstLineChars="0"/>
+              <w:rPr>
+                <w:rFonts w:ascii="DejaVu Sans" w:hAnsi="DejaVu Sans" w:eastAsia="DejaVu Sans" w:cs="DejaVu Sans"/>
+                <w:i w:val="false"/>
+                <w:b w:val="false"/>
+                <w:u w:val="none"/>
+                <w:strike w:val="false"/>
+                <w:sz w:val="22"/>
+                <w:szCs w:val="22"/>
+                <w:color w:val="000000"/>
+              </w:rPr>
+            </w:pPr>
+            <w:r>
+              <w:rPr>
+                <w:rFonts w:ascii="DejaVu Sans" w:hAnsi="DejaVu Sans" w:eastAsia="DejaVu Sans" w:cs="DejaVu Sans"/>
+                <w:i w:val="false"/>
+                <w:b w:val="false"/>
+                <w:u w:val="none"/>
+                <w:strike w:val="false"/>
+                <w:sz w:val="22"/>
+                <w:szCs w:val="22"/>
+                <w:color w:val="000000"/>
+              </w:rPr>
+              <w:t xml:space="preserve">4.681e-310</w:t>
+            </w:r>
+          </w:p>
+        </w:tc>
+        <w:tc>
+          <w:tcPr>
+            <w:tcBorders>
+              <w:bottom w:val="none" w:sz="0" w:space="0" w:color="000000"/>
+              <w:top w:val="none" w:sz="0" w:space="0" w:color="000000"/>
+              <w:left w:val="none" w:sz="0" w:space="0" w:color="000000"/>
+              <w:right w:val="none" w:sz="0" w:space="0" w:color="000000"/>
+            </w:tcBorders>
+            <w:shd w:val="clear" w:color="auto" w:fill="FFFFFF"/>
+            <w:tcMar>
+              <w:top w:w="0" w:type="dxa"/>
+              <w:bottom w:w="0" w:type="dxa"/>
+              <w:left w:w="0" w:type="dxa"/>
+              <w:right w:w="0" w:type="dxa"/>
+            </w:tcMar>
+            <w:vAlign w:val="center"/>
+          </w:tcPr>
+          <w:p>
+            <w:pPr>
+              <w:pStyle w:val="Normal"/>
+              <w:jc w:val="left"/>
+              <w:pBdr>
+                <w:bottom w:val="none" w:sz="0" w:space="0" w:color="000000"/>
+                <w:top w:val="none" w:sz="0" w:space="0" w:color="000000"/>
+                <w:left w:val="none" w:sz="0" w:space="0" w:color="000000"/>
+                <w:right w:val="none" w:sz="0" w:space="0" w:color="000000"/>
+              </w:pBdr>
+              <w:spacing w:after="100" w:before="100" w:line="240"/>
+              <w:ind w:left="100" w:right="100" w:firstLine="0" w:firstLineChars="0"/>
+              <w:rPr>
+                <w:rFonts w:ascii="DejaVu Sans" w:hAnsi="DejaVu Sans" w:eastAsia="DejaVu Sans" w:cs="DejaVu Sans"/>
+                <w:i w:val="false"/>
+                <w:b w:val="false"/>
+                <w:u w:val="none"/>
+                <w:strike w:val="false"/>
+                <w:sz w:val="22"/>
+                <w:szCs w:val="22"/>
+                <w:color w:val="000000"/>
+              </w:rPr>
+            </w:pPr>
+            <w:r>
+              <w:rPr>
+                <w:rFonts w:ascii="DejaVu Sans" w:hAnsi="DejaVu Sans" w:eastAsia="DejaVu Sans" w:cs="DejaVu Sans"/>
+                <w:i w:val="false"/>
+                <w:b w:val="false"/>
+                <w:u w:val="none"/>
+                <w:strike w:val="false"/>
+                <w:sz w:val="22"/>
+                <w:szCs w:val="22"/>
+                <w:color w:val="000000"/>
+              </w:rPr>
+              <w:t xml:space="preserve">1.080e-307</w:t>
+            </w:r>
+          </w:p>
+        </w:tc>
+        <w:tc>
+          <w:tcPr>
+            <w:tcBorders>
+              <w:bottom w:val="none" w:sz="0" w:space="0" w:color="000000"/>
+              <w:top w:val="none" w:sz="0" w:space="0" w:color="000000"/>
+              <w:left w:val="none" w:sz="0" w:space="0" w:color="000000"/>
+              <w:right w:val="none" w:sz="0" w:space="0" w:color="000000"/>
+            </w:tcBorders>
+            <w:shd w:val="clear" w:color="auto" w:fill="FFFFFF"/>
+            <w:tcMar>
+              <w:top w:w="0" w:type="dxa"/>
+              <w:bottom w:w="0" w:type="dxa"/>
+              <w:left w:w="0" w:type="dxa"/>
+              <w:right w:w="0" w:type="dxa"/>
+            </w:tcMar>
+            <w:vAlign w:val="center"/>
+          </w:tcPr>
+          <w:p>
+            <w:pPr>
+              <w:pStyle w:val="Normal"/>
+              <w:jc w:val="left"/>
+              <w:pBdr>
+                <w:bottom w:val="none" w:sz="0" w:space="0" w:color="000000"/>
+                <w:top w:val="none" w:sz="0" w:space="0" w:color="000000"/>
+                <w:left w:val="none" w:sz="0" w:space="0" w:color="000000"/>
+                <w:right w:val="none" w:sz="0" w:space="0" w:color="000000"/>
+              </w:pBdr>
+              <w:spacing w:after="100" w:before="100" w:line="240"/>
+              <w:ind w:left="100" w:right="100" w:firstLine="0" w:firstLineChars="0"/>
+              <w:rPr>
+                <w:rFonts w:ascii="DejaVu Sans" w:hAnsi="DejaVu Sans" w:eastAsia="DejaVu Sans" w:cs="DejaVu Sans"/>
+                <w:i w:val="false"/>
+                <w:b w:val="false"/>
+                <w:u w:val="none"/>
+                <w:strike w:val="false"/>
+                <w:sz w:val="22"/>
+                <w:szCs w:val="22"/>
+                <w:color w:val="000000"/>
+              </w:rPr>
+            </w:pPr>
+            <w:r>
+              <w:rPr>
+                <w:rFonts w:ascii="DejaVu Sans" w:hAnsi="DejaVu Sans" w:eastAsia="DejaVu Sans" w:cs="DejaVu Sans"/>
+                <w:i w:val="false"/>
+                <w:b w:val="false"/>
+                <w:u w:val="none"/>
+                <w:strike w:val="false"/>
+                <w:sz w:val="22"/>
+                <w:szCs w:val="22"/>
+                <w:color w:val="000000"/>
+              </w:rPr>
+              <w:t xml:space="preserve">0.4333 (0.4333, 0.4333)</w:t>
             </w:r>
           </w:p>
         </w:tc>
@@ -1811,175 +1976,10 @@
             </w:r>
           </w:p>
         </w:tc>
-        <w:tc>
-          <w:tcPr>
-            <w:tcBorders>
-              <w:bottom w:val="none" w:sz="0" w:space="0" w:color="000000"/>
-              <w:top w:val="none" w:sz="0" w:space="0" w:color="000000"/>
-              <w:left w:val="none" w:sz="0" w:space="0" w:color="000000"/>
-              <w:right w:val="none" w:sz="0" w:space="0" w:color="000000"/>
-            </w:tcBorders>
-            <w:shd w:val="clear" w:color="auto" w:fill="FFFFFF"/>
-            <w:tcMar>
-              <w:top w:w="0" w:type="dxa"/>
-              <w:bottom w:w="0" w:type="dxa"/>
-              <w:left w:w="0" w:type="dxa"/>
-              <w:right w:w="0" w:type="dxa"/>
-            </w:tcMar>
-            <w:vAlign w:val="center"/>
-          </w:tcPr>
-          <w:p>
-            <w:pPr>
-              <w:pStyle w:val="Normal"/>
-              <w:jc w:val="left"/>
-              <w:pBdr>
-                <w:bottom w:val="none" w:sz="0" w:space="0" w:color="000000"/>
-                <w:top w:val="none" w:sz="0" w:space="0" w:color="000000"/>
-                <w:left w:val="none" w:sz="0" w:space="0" w:color="000000"/>
-                <w:right w:val="none" w:sz="0" w:space="0" w:color="000000"/>
-              </w:pBdr>
-              <w:spacing w:after="100" w:before="100" w:line="240"/>
-              <w:ind w:left="100" w:right="100" w:firstLine="0" w:firstLineChars="0"/>
-              <w:rPr>
-                <w:rFonts w:ascii="DejaVu Sans" w:hAnsi="DejaVu Sans" w:eastAsia="DejaVu Sans" w:cs="DejaVu Sans"/>
-                <w:i w:val="false"/>
-                <w:b w:val="false"/>
-                <w:u w:val="none"/>
-                <w:strike w:val="false"/>
-                <w:sz w:val="22"/>
-                <w:szCs w:val="22"/>
-                <w:color w:val="000000"/>
-              </w:rPr>
-            </w:pPr>
-            <w:r>
-              <w:rPr>
-                <w:rFonts w:ascii="DejaVu Sans" w:hAnsi="DejaVu Sans" w:eastAsia="DejaVu Sans" w:cs="DejaVu Sans"/>
-                <w:i w:val="false"/>
-                <w:b w:val="false"/>
-                <w:u w:val="none"/>
-                <w:strike w:val="false"/>
-                <w:sz w:val="22"/>
-                <w:szCs w:val="22"/>
-                <w:color w:val="000000"/>
-              </w:rPr>
-              <w:t xml:space="preserve">0.433</w:t>
-            </w:r>
-          </w:p>
-        </w:tc>
-        <w:tc>
-          <w:tcPr>
-            <w:tcBorders>
-              <w:bottom w:val="none" w:sz="0" w:space="0" w:color="000000"/>
-              <w:top w:val="none" w:sz="0" w:space="0" w:color="000000"/>
-              <w:left w:val="none" w:sz="0" w:space="0" w:color="000000"/>
-              <w:right w:val="none" w:sz="0" w:space="0" w:color="000000"/>
-            </w:tcBorders>
-            <w:shd w:val="clear" w:color="auto" w:fill="FFFFFF"/>
-            <w:tcMar>
-              <w:top w:w="0" w:type="dxa"/>
-              <w:bottom w:w="0" w:type="dxa"/>
-              <w:left w:w="0" w:type="dxa"/>
-              <w:right w:w="0" w:type="dxa"/>
-            </w:tcMar>
-            <w:vAlign w:val="center"/>
-          </w:tcPr>
-          <w:p>
-            <w:pPr>
-              <w:pStyle w:val="Normal"/>
-              <w:jc w:val="left"/>
-              <w:pBdr>
-                <w:bottom w:val="none" w:sz="0" w:space="0" w:color="000000"/>
-                <w:top w:val="none" w:sz="0" w:space="0" w:color="000000"/>
-                <w:left w:val="none" w:sz="0" w:space="0" w:color="000000"/>
-                <w:right w:val="none" w:sz="0" w:space="0" w:color="000000"/>
-              </w:pBdr>
-              <w:spacing w:after="100" w:before="100" w:line="240"/>
-              <w:ind w:left="100" w:right="100" w:firstLine="0" w:firstLineChars="0"/>
-              <w:rPr>
-                <w:rFonts w:ascii="DejaVu Sans" w:hAnsi="DejaVu Sans" w:eastAsia="DejaVu Sans" w:cs="DejaVu Sans"/>
-                <w:i w:val="false"/>
-                <w:b w:val="false"/>
-                <w:u w:val="none"/>
-                <w:strike w:val="false"/>
-                <w:sz w:val="22"/>
-                <w:szCs w:val="22"/>
-                <w:color w:val="000000"/>
-              </w:rPr>
-            </w:pPr>
-            <w:r>
-              <w:rPr>
-                <w:rFonts w:ascii="DejaVu Sans" w:hAnsi="DejaVu Sans" w:eastAsia="DejaVu Sans" w:cs="DejaVu Sans"/>
-                <w:i w:val="false"/>
-                <w:b w:val="false"/>
-                <w:u w:val="none"/>
-                <w:strike w:val="false"/>
-                <w:sz w:val="22"/>
-                <w:szCs w:val="22"/>
-                <w:color w:val="000000"/>
-              </w:rPr>
-              <w:t xml:space="preserve"> </w:t>
-            </w:r>
-          </w:p>
-        </w:tc>
-        <w:tc>
-          <w:tcPr>
-            <w:tcBorders>
-              <w:bottom w:val="none" w:sz="0" w:space="0" w:color="000000"/>
-              <w:top w:val="none" w:sz="0" w:space="0" w:color="000000"/>
-              <w:left w:val="none" w:sz="0" w:space="0" w:color="000000"/>
-              <w:right w:val="none" w:sz="0" w:space="0" w:color="000000"/>
-            </w:tcBorders>
-            <w:shd w:val="clear" w:color="auto" w:fill="FFFFFF"/>
-            <w:tcMar>
-              <w:top w:w="0" w:type="dxa"/>
-              <w:bottom w:w="0" w:type="dxa"/>
-              <w:left w:w="0" w:type="dxa"/>
-              <w:right w:w="0" w:type="dxa"/>
-            </w:tcMar>
-            <w:vAlign w:val="center"/>
-          </w:tcPr>
-          <w:p>
-            <w:pPr>
-              <w:pStyle w:val="Normal"/>
-              <w:jc w:val="left"/>
-              <w:pBdr>
-                <w:bottom w:val="none" w:sz="0" w:space="0" w:color="000000"/>
-                <w:top w:val="none" w:sz="0" w:space="0" w:color="000000"/>
-                <w:left w:val="none" w:sz="0" w:space="0" w:color="000000"/>
-                <w:right w:val="none" w:sz="0" w:space="0" w:color="000000"/>
-              </w:pBdr>
-              <w:spacing w:after="100" w:before="100" w:line="240"/>
-              <w:ind w:left="100" w:right="100" w:firstLine="0" w:firstLineChars="0"/>
-              <w:rPr>
-                <w:rFonts w:ascii="DejaVu Sans" w:hAnsi="DejaVu Sans" w:eastAsia="DejaVu Sans" w:cs="DejaVu Sans"/>
-                <w:i w:val="false"/>
-                <w:b w:val="false"/>
-                <w:u w:val="none"/>
-                <w:strike w:val="false"/>
-                <w:sz w:val="22"/>
-                <w:szCs w:val="22"/>
-                <w:color w:val="000000"/>
-              </w:rPr>
-            </w:pPr>
-            <w:r>
-              <w:rPr>
-                <w:rFonts w:ascii="DejaVu Sans" w:hAnsi="DejaVu Sans" w:eastAsia="DejaVu Sans" w:cs="DejaVu Sans"/>
-                <w:i w:val="false"/>
-                <w:b w:val="false"/>
-                <w:u w:val="none"/>
-                <w:strike w:val="false"/>
-                <w:sz w:val="22"/>
-                <w:szCs w:val="22"/>
-                <w:color w:val="000000"/>
-              </w:rPr>
-              <w:t xml:space="preserve"> </w:t>
-            </w:r>
-          </w:p>
-        </w:tc>
       </w:tr>
       <w:tr>
         <w:trPr>
-          <w:trHeight w:val="591" w:hRule="auto"/>
+          <w:trHeight w:val="647" w:hRule="auto"/>
         </w:trPr>
         <w:tc>
           <w:tcPr>
@@ -2087,7 +2087,172 @@
                 <w:szCs w:val="22"/>
                 <w:color w:val="000000"/>
               </w:rPr>
-              <w:t xml:space="preserve">0.0543</w:t>
+              <w:t xml:space="preserve">0.05426</w:t>
+            </w:r>
+          </w:p>
+        </w:tc>
+        <w:tc>
+          <w:tcPr>
+            <w:tcBorders>
+              <w:bottom w:val="single" w:sz="12" w:space="0" w:color="666666"/>
+              <w:top w:val="none" w:sz="0" w:space="0" w:color="000000"/>
+              <w:left w:val="none" w:sz="0" w:space="0" w:color="000000"/>
+              <w:right w:val="none" w:sz="0" w:space="0" w:color="000000"/>
+            </w:tcBorders>
+            <w:shd w:val="clear" w:color="auto" w:fill="FFFFFF"/>
+            <w:tcMar>
+              <w:top w:w="0" w:type="dxa"/>
+              <w:bottom w:w="0" w:type="dxa"/>
+              <w:left w:w="0" w:type="dxa"/>
+              <w:right w:w="0" w:type="dxa"/>
+            </w:tcMar>
+            <w:vAlign w:val="center"/>
+          </w:tcPr>
+          <w:p>
+            <w:pPr>
+              <w:pStyle w:val="Normal"/>
+              <w:jc w:val="left"/>
+              <w:pBdr>
+                <w:bottom w:val="none" w:sz="0" w:space="0" w:color="000000"/>
+                <w:top w:val="none" w:sz="0" w:space="0" w:color="000000"/>
+                <w:left w:val="none" w:sz="0" w:space="0" w:color="000000"/>
+                <w:right w:val="none" w:sz="0" w:space="0" w:color="000000"/>
+              </w:pBdr>
+              <w:spacing w:after="100" w:before="100" w:line="240"/>
+              <w:ind w:left="100" w:right="100" w:firstLine="0" w:firstLineChars="0"/>
+              <w:rPr>
+                <w:rFonts w:ascii="DejaVu Sans" w:hAnsi="DejaVu Sans" w:eastAsia="DejaVu Sans" w:cs="DejaVu Sans"/>
+                <w:i w:val="false"/>
+                <w:b w:val="false"/>
+                <w:u w:val="none"/>
+                <w:strike w:val="false"/>
+                <w:sz w:val="22"/>
+                <w:szCs w:val="22"/>
+                <w:color w:val="000000"/>
+              </w:rPr>
+            </w:pPr>
+            <w:r>
+              <w:rPr>
+                <w:rFonts w:ascii="DejaVu Sans" w:hAnsi="DejaVu Sans" w:eastAsia="DejaVu Sans" w:cs="DejaVu Sans"/>
+                <w:i w:val="false"/>
+                <w:b w:val="false"/>
+                <w:u w:val="none"/>
+                <w:strike w:val="false"/>
+                <w:sz w:val="22"/>
+                <w:szCs w:val="22"/>
+                <w:color w:val="000000"/>
+              </w:rPr>
+              <w:t xml:space="preserve">0.007258</w:t>
+            </w:r>
+          </w:p>
+        </w:tc>
+        <w:tc>
+          <w:tcPr>
+            <w:tcBorders>
+              <w:bottom w:val="single" w:sz="12" w:space="0" w:color="666666"/>
+              <w:top w:val="none" w:sz="0" w:space="0" w:color="000000"/>
+              <w:left w:val="none" w:sz="0" w:space="0" w:color="000000"/>
+              <w:right w:val="none" w:sz="0" w:space="0" w:color="000000"/>
+            </w:tcBorders>
+            <w:shd w:val="clear" w:color="auto" w:fill="FFFFFF"/>
+            <w:tcMar>
+              <w:top w:w="0" w:type="dxa"/>
+              <w:bottom w:w="0" w:type="dxa"/>
+              <w:left w:w="0" w:type="dxa"/>
+              <w:right w:w="0" w:type="dxa"/>
+            </w:tcMar>
+            <w:vAlign w:val="center"/>
+          </w:tcPr>
+          <w:p>
+            <w:pPr>
+              <w:pStyle w:val="Normal"/>
+              <w:jc w:val="left"/>
+              <w:pBdr>
+                <w:bottom w:val="none" w:sz="0" w:space="0" w:color="000000"/>
+                <w:top w:val="none" w:sz="0" w:space="0" w:color="000000"/>
+                <w:left w:val="none" w:sz="0" w:space="0" w:color="000000"/>
+                <w:right w:val="none" w:sz="0" w:space="0" w:color="000000"/>
+              </w:pBdr>
+              <w:spacing w:after="100" w:before="100" w:line="240"/>
+              <w:ind w:left="100" w:right="100" w:firstLine="0" w:firstLineChars="0"/>
+              <w:rPr>
+                <w:rFonts w:ascii="DejaVu Sans" w:hAnsi="DejaVu Sans" w:eastAsia="DejaVu Sans" w:cs="DejaVu Sans"/>
+                <w:i w:val="false"/>
+                <w:b w:val="false"/>
+                <w:u w:val="none"/>
+                <w:strike w:val="false"/>
+                <w:sz w:val="22"/>
+                <w:szCs w:val="22"/>
+                <w:color w:val="000000"/>
+              </w:rPr>
+            </w:pPr>
+            <w:r>
+              <w:rPr>
+                <w:rFonts w:ascii="DejaVu Sans" w:hAnsi="DejaVu Sans" w:eastAsia="DejaVu Sans" w:cs="DejaVu Sans"/>
+                <w:i w:val="false"/>
+                <w:b w:val="false"/>
+                <w:u w:val="none"/>
+                <w:strike w:val="false"/>
+                <w:sz w:val="22"/>
+                <w:szCs w:val="22"/>
+                <w:color w:val="000000"/>
+              </w:rPr>
+              <w:t xml:space="preserve">13.38</w:t>
+            </w:r>
+          </w:p>
+        </w:tc>
+        <w:tc>
+          <w:tcPr>
+            <w:tcBorders>
+              <w:bottom w:val="single" w:sz="12" w:space="0" w:color="666666"/>
+              <w:top w:val="none" w:sz="0" w:space="0" w:color="000000"/>
+              <w:left w:val="none" w:sz="0" w:space="0" w:color="000000"/>
+              <w:right w:val="none" w:sz="0" w:space="0" w:color="000000"/>
+            </w:tcBorders>
+            <w:shd w:val="clear" w:color="auto" w:fill="FFFFFF"/>
+            <w:tcMar>
+              <w:top w:w="0" w:type="dxa"/>
+              <w:bottom w:w="0" w:type="dxa"/>
+              <w:left w:w="0" w:type="dxa"/>
+              <w:right w:w="0" w:type="dxa"/>
+            </w:tcMar>
+            <w:vAlign w:val="center"/>
+          </w:tcPr>
+          <w:p>
+            <w:pPr>
+              <w:pStyle w:val="Normal"/>
+              <w:jc w:val="left"/>
+              <w:pBdr>
+                <w:bottom w:val="none" w:sz="0" w:space="0" w:color="000000"/>
+                <w:top w:val="none" w:sz="0" w:space="0" w:color="000000"/>
+                <w:left w:val="none" w:sz="0" w:space="0" w:color="000000"/>
+                <w:right w:val="none" w:sz="0" w:space="0" w:color="000000"/>
+              </w:pBdr>
+              <w:spacing w:after="100" w:before="100" w:line="240"/>
+              <w:ind w:left="100" w:right="100" w:firstLine="0" w:firstLineChars="0"/>
+              <w:rPr>
+                <w:rFonts w:ascii="DejaVu Sans" w:hAnsi="DejaVu Sans" w:eastAsia="DejaVu Sans" w:cs="DejaVu Sans"/>
+                <w:i w:val="false"/>
+                <w:b w:val="false"/>
+                <w:u w:val="none"/>
+                <w:strike w:val="false"/>
+                <w:sz w:val="22"/>
+                <w:szCs w:val="22"/>
+                <w:color w:val="000000"/>
+              </w:rPr>
+            </w:pPr>
+            <w:r>
+              <w:rPr>
+                <w:rFonts w:ascii="DejaVu Sans" w:hAnsi="DejaVu Sans" w:eastAsia="DejaVu Sans" w:cs="DejaVu Sans"/>
+                <w:i w:val="false"/>
+                <w:b w:val="false"/>
+                <w:u w:val="none"/>
+                <w:strike w:val="false"/>
+                <w:sz w:val="22"/>
+                <w:szCs w:val="22"/>
+                <w:color w:val="000000"/>
+              </w:rPr>
+              <w:t xml:space="preserve">0.05426 (0.04003, 0.06849)</w:t>
             </w:r>
           </w:p>
         </w:tc>
@@ -2201,171 +2366,6 @@
             </w:r>
           </w:p>
         </w:tc>
-        <w:tc>
-          <w:tcPr>
-            <w:tcBorders>
-              <w:bottom w:val="single" w:sz="12" w:space="0" w:color="666666"/>
-              <w:top w:val="none" w:sz="0" w:space="0" w:color="000000"/>
-              <w:left w:val="none" w:sz="0" w:space="0" w:color="000000"/>
-              <w:right w:val="none" w:sz="0" w:space="0" w:color="000000"/>
-            </w:tcBorders>
-            <w:shd w:val="clear" w:color="auto" w:fill="FFFFFF"/>
-            <w:tcMar>
-              <w:top w:w="0" w:type="dxa"/>
-              <w:bottom w:w="0" w:type="dxa"/>
-              <w:left w:w="0" w:type="dxa"/>
-              <w:right w:w="0" w:type="dxa"/>
-            </w:tcMar>
-            <w:vAlign w:val="center"/>
-          </w:tcPr>
-          <w:p>
-            <w:pPr>
-              <w:pStyle w:val="Normal"/>
-              <w:jc w:val="left"/>
-              <w:pBdr>
-                <w:bottom w:val="none" w:sz="0" w:space="0" w:color="000000"/>
-                <w:top w:val="none" w:sz="0" w:space="0" w:color="000000"/>
-                <w:left w:val="none" w:sz="0" w:space="0" w:color="000000"/>
-                <w:right w:val="none" w:sz="0" w:space="0" w:color="000000"/>
-              </w:pBdr>
-              <w:spacing w:after="100" w:before="100" w:line="240"/>
-              <w:ind w:left="100" w:right="100" w:firstLine="0" w:firstLineChars="0"/>
-              <w:rPr>
-                <w:rFonts w:ascii="DejaVu Sans" w:hAnsi="DejaVu Sans" w:eastAsia="DejaVu Sans" w:cs="DejaVu Sans"/>
-                <w:i w:val="false"/>
-                <w:b w:val="false"/>
-                <w:u w:val="none"/>
-                <w:strike w:val="false"/>
-                <w:sz w:val="22"/>
-                <w:szCs w:val="22"/>
-                <w:color w:val="000000"/>
-              </w:rPr>
-            </w:pPr>
-            <w:r>
-              <w:rPr>
-                <w:rFonts w:ascii="DejaVu Sans" w:hAnsi="DejaVu Sans" w:eastAsia="DejaVu Sans" w:cs="DejaVu Sans"/>
-                <w:i w:val="false"/>
-                <w:b w:val="false"/>
-                <w:u w:val="none"/>
-                <w:strike w:val="false"/>
-                <w:sz w:val="22"/>
-                <w:szCs w:val="22"/>
-                <w:color w:val="000000"/>
-              </w:rPr>
-              <w:t xml:space="preserve">0.0543</w:t>
-            </w:r>
-          </w:p>
-        </w:tc>
-        <w:tc>
-          <w:tcPr>
-            <w:tcBorders>
-              <w:bottom w:val="single" w:sz="12" w:space="0" w:color="666666"/>
-              <w:top w:val="none" w:sz="0" w:space="0" w:color="000000"/>
-              <w:left w:val="none" w:sz="0" w:space="0" w:color="000000"/>
-              <w:right w:val="none" w:sz="0" w:space="0" w:color="000000"/>
-            </w:tcBorders>
-            <w:shd w:val="clear" w:color="auto" w:fill="FFFFFF"/>
-            <w:tcMar>
-              <w:top w:w="0" w:type="dxa"/>
-              <w:bottom w:w="0" w:type="dxa"/>
-              <w:left w:w="0" w:type="dxa"/>
-              <w:right w:w="0" w:type="dxa"/>
-            </w:tcMar>
-            <w:vAlign w:val="center"/>
-          </w:tcPr>
-          <w:p>
-            <w:pPr>
-              <w:pStyle w:val="Normal"/>
-              <w:jc w:val="left"/>
-              <w:pBdr>
-                <w:bottom w:val="none" w:sz="0" w:space="0" w:color="000000"/>
-                <w:top w:val="none" w:sz="0" w:space="0" w:color="000000"/>
-                <w:left w:val="none" w:sz="0" w:space="0" w:color="000000"/>
-                <w:right w:val="none" w:sz="0" w:space="0" w:color="000000"/>
-              </w:pBdr>
-              <w:spacing w:after="100" w:before="100" w:line="240"/>
-              <w:ind w:left="100" w:right="100" w:firstLine="0" w:firstLineChars="0"/>
-              <w:rPr>
-                <w:rFonts w:ascii="DejaVu Sans" w:hAnsi="DejaVu Sans" w:eastAsia="DejaVu Sans" w:cs="DejaVu Sans"/>
-                <w:i w:val="false"/>
-                <w:b w:val="false"/>
-                <w:u w:val="none"/>
-                <w:strike w:val="false"/>
-                <w:sz w:val="22"/>
-                <w:szCs w:val="22"/>
-                <w:color w:val="000000"/>
-              </w:rPr>
-            </w:pPr>
-            <w:r>
-              <w:rPr>
-                <w:rFonts w:ascii="DejaVu Sans" w:hAnsi="DejaVu Sans" w:eastAsia="DejaVu Sans" w:cs="DejaVu Sans"/>
-                <w:i w:val="false"/>
-                <w:b w:val="false"/>
-                <w:u w:val="none"/>
-                <w:strike w:val="false"/>
-                <w:sz w:val="22"/>
-                <w:szCs w:val="22"/>
-                <w:color w:val="000000"/>
-              </w:rPr>
-              <w:t xml:space="preserve"> </w:t>
-            </w:r>
-          </w:p>
-        </w:tc>
-        <w:tc>
-          <w:tcPr>
-            <w:tcBorders>
-              <w:bottom w:val="single" w:sz="12" w:space="0" w:color="666666"/>
-              <w:top w:val="none" w:sz="0" w:space="0" w:color="000000"/>
-              <w:left w:val="none" w:sz="0" w:space="0" w:color="000000"/>
-              <w:right w:val="none" w:sz="0" w:space="0" w:color="000000"/>
-            </w:tcBorders>
-            <w:shd w:val="clear" w:color="auto" w:fill="FFFFFF"/>
-            <w:tcMar>
-              <w:top w:w="0" w:type="dxa"/>
-              <w:bottom w:w="0" w:type="dxa"/>
-              <w:left w:w="0" w:type="dxa"/>
-              <w:right w:w="0" w:type="dxa"/>
-            </w:tcMar>
-            <w:vAlign w:val="center"/>
-          </w:tcPr>
-          <w:p>
-            <w:pPr>
-              <w:pStyle w:val="Normal"/>
-              <w:jc w:val="left"/>
-              <w:pBdr>
-                <w:bottom w:val="none" w:sz="0" w:space="0" w:color="000000"/>
-                <w:top w:val="none" w:sz="0" w:space="0" w:color="000000"/>
-                <w:left w:val="none" w:sz="0" w:space="0" w:color="000000"/>
-                <w:right w:val="none" w:sz="0" w:space="0" w:color="000000"/>
-              </w:pBdr>
-              <w:spacing w:after="100" w:before="100" w:line="240"/>
-              <w:ind w:left="100" w:right="100" w:firstLine="0" w:firstLineChars="0"/>
-              <w:rPr>
-                <w:rFonts w:ascii="DejaVu Sans" w:hAnsi="DejaVu Sans" w:eastAsia="DejaVu Sans" w:cs="DejaVu Sans"/>
-                <w:i w:val="false"/>
-                <w:b w:val="false"/>
-                <w:u w:val="none"/>
-                <w:strike w:val="false"/>
-                <w:sz w:val="22"/>
-                <w:szCs w:val="22"/>
-                <w:color w:val="000000"/>
-              </w:rPr>
-            </w:pPr>
-            <w:r>
-              <w:rPr>
-                <w:rFonts w:ascii="DejaVu Sans" w:hAnsi="DejaVu Sans" w:eastAsia="DejaVu Sans" w:cs="DejaVu Sans"/>
-                <w:i w:val="false"/>
-                <w:b w:val="false"/>
-                <w:u w:val="none"/>
-                <w:strike w:val="false"/>
-                <w:sz w:val="22"/>
-                <w:szCs w:val="22"/>
-                <w:color w:val="000000"/>
-              </w:rPr>
-              <w:t xml:space="preserve"> </w:t>
-            </w:r>
-          </w:p>
-        </w:tc>
       </w:tr>
     </w:tbl>
     <w:p>
@@ -2379,7 +2379,7 @@
         </w:rPr>
         <w:t xml:space="preserve">Table </w:t>
       </w:r>
-      <w:bookmarkStart w:id="52e2569b-7b3b-43c2-8d1d-d7f1199957ea" w:name="pest_table"/>
+      <w:bookmarkStart w:id="ea7f6035-e5f3-496b-b3e6-7773981be98f" w:name="pest_table"/>
       <w:r>
         <w:rPr/>
         <w:t xml:space="preserve"/>
@@ -2400,7 +2400,7 @@
         <w:rPr/>
         <w:t xml:space="preserve"/>
       </w:r>
-      <w:bookmarkEnd w:id="52e2569b-7b3b-43c2-8d1d-d7f1199957ea"/>
+      <w:bookmarkEnd w:id="ea7f6035-e5f3-496b-b3e6-7773981be98f"/>
       <w:r>
         <w:rPr>
           <w:rFonts/>
@@ -2496,7 +2496,7 @@
         </w:rPr>
         <w:t xml:space="preserve">Figure </w:t>
       </w:r>
-      <w:bookmarkStart w:id="e4efdaf9-1c19-43ec-9a72-ef32f36aa0cd" w:name="ind_plots"/>
+      <w:bookmarkStart w:id="d100573e-faeb-42db-91ba-7955ff49fec6" w:name="ind_plots"/>
       <w:r>
         <w:rPr/>
         <w:t xml:space="preserve"/>
@@ -2517,7 +2517,7 @@
         <w:rPr/>
         <w:t xml:space="preserve"/>
       </w:r>
-      <w:bookmarkEnd w:id="e4efdaf9-1c19-43ec-9a72-ef32f36aa0cd"/>
+      <w:bookmarkEnd w:id="d100573e-faeb-42db-91ba-7955ff49fec6"/>
       <w:r>
         <w:rPr>
           <w:rFonts/>
@@ -2599,7 +2599,7 @@
         </w:rPr>
         <w:t xml:space="preserve">Figure </w:t>
       </w:r>
-      <w:bookmarkStart w:id="6d407b34-58d4-4c79-97df-65cc8df28ce9" w:name="dv_vs_pred_ipred"/>
+      <w:bookmarkStart w:id="38a7fae8-2b9c-47f1-80ca-7caecee1b31a" w:name="dv_vs_pred_ipred"/>
       <w:r>
         <w:rPr/>
         <w:t xml:space="preserve"/>
@@ -2620,7 +2620,7 @@
         <w:rPr/>
         <w:t xml:space="preserve"/>
       </w:r>
-      <w:bookmarkEnd w:id="6d407b34-58d4-4c79-97df-65cc8df28ce9"/>
+      <w:bookmarkEnd w:id="38a7fae8-2b9c-47f1-80ca-7caecee1b31a"/>
       <w:r>
         <w:rPr>
           <w:rFonts/>
@@ -2708,7 +2708,7 @@
         </w:rPr>
         <w:t xml:space="preserve">Figure </w:t>
       </w:r>
-      <w:bookmarkStart w:id="0b1dbc28-d0c5-48b0-81b9-e76016c996a8" w:name="prm_vs_iteration"/>
+      <w:bookmarkStart w:id="3c239b73-b6a7-4b7a-9946-209f62f4f4f6" w:name="prm_vs_iteration"/>
       <w:r>
         <w:rPr/>
         <w:t xml:space="preserve"/>
@@ -2729,7 +2729,7 @@
         <w:rPr/>
         <w:t xml:space="preserve"/>
       </w:r>
-      <w:bookmarkEnd w:id="0b1dbc28-d0c5-48b0-81b9-e76016c996a8"/>
+      <w:bookmarkEnd w:id="3c239b73-b6a7-4b7a-9946-209f62f4f4f6"/>
       <w:r>
         <w:rPr>
           <w:rFonts/>

</xml_diff>

<commit_message>
Deploying to gh-pages from @ nlmixr2/monolix2rx@d39cf0c23e0211e305839e9262e14e9bfaae2da5 🚀
</commit_message>
<xml_diff>
--- a/articles/mod-Word.docx
+++ b/articles/mod-Word.docx
@@ -20,8 +20,8 @@
       <w:tblGrid>
         <w:gridCol w:w="1565"/>
         <w:gridCol w:w="1320"/>
-        <w:gridCol w:w="1675"/>
-        <w:gridCol w:w="1675"/>
+        <w:gridCol w:w="1320"/>
+        <w:gridCol w:w="1051"/>
         <w:gridCol w:w="3521"/>
         <w:gridCol w:w="1537"/>
         <w:gridCol w:w="1798"/>
@@ -1752,7 +1752,7 @@
                 <w:szCs w:val="22"/>
                 <w:color w:val="000000"/>
               </w:rPr>
-              <w:t xml:space="preserve">4.681e-310</w:t>
+              <w:t xml:space="preserve"/>
             </w:r>
           </w:p>
         </w:tc>
@@ -1807,7 +1807,7 @@
                 <w:szCs w:val="22"/>
                 <w:color w:val="000000"/>
               </w:rPr>
-              <w:t xml:space="preserve">1.080e-307</w:t>
+              <w:t xml:space="preserve"/>
             </w:r>
           </w:p>
         </w:tc>
@@ -1862,7 +1862,7 @@
                 <w:szCs w:val="22"/>
                 <w:color w:val="000000"/>
               </w:rPr>
-              <w:t xml:space="preserve">0.4333 (0.4333, 0.4333)</w:t>
+              <w:t xml:space="preserve">0.4333</w:t>
             </w:r>
           </w:p>
         </w:tc>
@@ -2142,171 +2142,6 @@
                 <w:szCs w:val="22"/>
                 <w:color w:val="000000"/>
               </w:rPr>
-              <w:t xml:space="preserve">0.007258</w:t>
-            </w:r>
-          </w:p>
-        </w:tc>
-        <w:tc>
-          <w:tcPr>
-            <w:tcBorders>
-              <w:bottom w:val="single" w:sz="12" w:space="0" w:color="666666"/>
-              <w:top w:val="none" w:sz="0" w:space="0" w:color="000000"/>
-              <w:left w:val="none" w:sz="0" w:space="0" w:color="000000"/>
-              <w:right w:val="none" w:sz="0" w:space="0" w:color="000000"/>
-            </w:tcBorders>
-            <w:shd w:val="clear" w:color="auto" w:fill="FFFFFF"/>
-            <w:tcMar>
-              <w:top w:w="0" w:type="dxa"/>
-              <w:bottom w:w="0" w:type="dxa"/>
-              <w:left w:w="0" w:type="dxa"/>
-              <w:right w:w="0" w:type="dxa"/>
-            </w:tcMar>
-            <w:vAlign w:val="center"/>
-          </w:tcPr>
-          <w:p>
-            <w:pPr>
-              <w:pStyle w:val="Normal"/>
-              <w:jc w:val="left"/>
-              <w:pBdr>
-                <w:bottom w:val="none" w:sz="0" w:space="0" w:color="000000"/>
-                <w:top w:val="none" w:sz="0" w:space="0" w:color="000000"/>
-                <w:left w:val="none" w:sz="0" w:space="0" w:color="000000"/>
-                <w:right w:val="none" w:sz="0" w:space="0" w:color="000000"/>
-              </w:pBdr>
-              <w:spacing w:after="100" w:before="100" w:line="240"/>
-              <w:ind w:left="100" w:right="100" w:firstLine="0" w:firstLineChars="0"/>
-              <w:rPr>
-                <w:rFonts w:ascii="DejaVu Sans" w:hAnsi="DejaVu Sans" w:eastAsia="DejaVu Sans" w:cs="DejaVu Sans"/>
-                <w:i w:val="false"/>
-                <w:b w:val="false"/>
-                <w:u w:val="none"/>
-                <w:strike w:val="false"/>
-                <w:sz w:val="22"/>
-                <w:szCs w:val="22"/>
-                <w:color w:val="000000"/>
-              </w:rPr>
-            </w:pPr>
-            <w:r>
-              <w:rPr>
-                <w:rFonts w:ascii="DejaVu Sans" w:hAnsi="DejaVu Sans" w:eastAsia="DejaVu Sans" w:cs="DejaVu Sans"/>
-                <w:i w:val="false"/>
-                <w:b w:val="false"/>
-                <w:u w:val="none"/>
-                <w:strike w:val="false"/>
-                <w:sz w:val="22"/>
-                <w:szCs w:val="22"/>
-                <w:color w:val="000000"/>
-              </w:rPr>
-              <w:t xml:space="preserve">13.38</w:t>
-            </w:r>
-          </w:p>
-        </w:tc>
-        <w:tc>
-          <w:tcPr>
-            <w:tcBorders>
-              <w:bottom w:val="single" w:sz="12" w:space="0" w:color="666666"/>
-              <w:top w:val="none" w:sz="0" w:space="0" w:color="000000"/>
-              <w:left w:val="none" w:sz="0" w:space="0" w:color="000000"/>
-              <w:right w:val="none" w:sz="0" w:space="0" w:color="000000"/>
-            </w:tcBorders>
-            <w:shd w:val="clear" w:color="auto" w:fill="FFFFFF"/>
-            <w:tcMar>
-              <w:top w:w="0" w:type="dxa"/>
-              <w:bottom w:w="0" w:type="dxa"/>
-              <w:left w:w="0" w:type="dxa"/>
-              <w:right w:w="0" w:type="dxa"/>
-            </w:tcMar>
-            <w:vAlign w:val="center"/>
-          </w:tcPr>
-          <w:p>
-            <w:pPr>
-              <w:pStyle w:val="Normal"/>
-              <w:jc w:val="left"/>
-              <w:pBdr>
-                <w:bottom w:val="none" w:sz="0" w:space="0" w:color="000000"/>
-                <w:top w:val="none" w:sz="0" w:space="0" w:color="000000"/>
-                <w:left w:val="none" w:sz="0" w:space="0" w:color="000000"/>
-                <w:right w:val="none" w:sz="0" w:space="0" w:color="000000"/>
-              </w:pBdr>
-              <w:spacing w:after="100" w:before="100" w:line="240"/>
-              <w:ind w:left="100" w:right="100" w:firstLine="0" w:firstLineChars="0"/>
-              <w:rPr>
-                <w:rFonts w:ascii="DejaVu Sans" w:hAnsi="DejaVu Sans" w:eastAsia="DejaVu Sans" w:cs="DejaVu Sans"/>
-                <w:i w:val="false"/>
-                <w:b w:val="false"/>
-                <w:u w:val="none"/>
-                <w:strike w:val="false"/>
-                <w:sz w:val="22"/>
-                <w:szCs w:val="22"/>
-                <w:color w:val="000000"/>
-              </w:rPr>
-            </w:pPr>
-            <w:r>
-              <w:rPr>
-                <w:rFonts w:ascii="DejaVu Sans" w:hAnsi="DejaVu Sans" w:eastAsia="DejaVu Sans" w:cs="DejaVu Sans"/>
-                <w:i w:val="false"/>
-                <w:b w:val="false"/>
-                <w:u w:val="none"/>
-                <w:strike w:val="false"/>
-                <w:sz w:val="22"/>
-                <w:szCs w:val="22"/>
-                <w:color w:val="000000"/>
-              </w:rPr>
-              <w:t xml:space="preserve">0.05426 (0.04003, 0.06849)</w:t>
-            </w:r>
-          </w:p>
-        </w:tc>
-        <w:tc>
-          <w:tcPr>
-            <w:tcBorders>
-              <w:bottom w:val="single" w:sz="12" w:space="0" w:color="666666"/>
-              <w:top w:val="none" w:sz="0" w:space="0" w:color="000000"/>
-              <w:left w:val="none" w:sz="0" w:space="0" w:color="000000"/>
-              <w:right w:val="none" w:sz="0" w:space="0" w:color="000000"/>
-            </w:tcBorders>
-            <w:shd w:val="clear" w:color="auto" w:fill="FFFFFF"/>
-            <w:tcMar>
-              <w:top w:w="0" w:type="dxa"/>
-              <w:bottom w:w="0" w:type="dxa"/>
-              <w:left w:w="0" w:type="dxa"/>
-              <w:right w:w="0" w:type="dxa"/>
-            </w:tcMar>
-            <w:vAlign w:val="center"/>
-          </w:tcPr>
-          <w:p>
-            <w:pPr>
-              <w:pStyle w:val="Normal"/>
-              <w:jc w:val="left"/>
-              <w:pBdr>
-                <w:bottom w:val="none" w:sz="0" w:space="0" w:color="000000"/>
-                <w:top w:val="none" w:sz="0" w:space="0" w:color="000000"/>
-                <w:left w:val="none" w:sz="0" w:space="0" w:color="000000"/>
-                <w:right w:val="none" w:sz="0" w:space="0" w:color="000000"/>
-              </w:pBdr>
-              <w:spacing w:after="100" w:before="100" w:line="240"/>
-              <w:ind w:left="100" w:right="100" w:firstLine="0" w:firstLineChars="0"/>
-              <w:rPr>
-                <w:rFonts w:ascii="DejaVu Sans" w:hAnsi="DejaVu Sans" w:eastAsia="DejaVu Sans" w:cs="DejaVu Sans"/>
-                <w:i w:val="false"/>
-                <w:b w:val="false"/>
-                <w:u w:val="none"/>
-                <w:strike w:val="false"/>
-                <w:sz w:val="22"/>
-                <w:szCs w:val="22"/>
-                <w:color w:val="000000"/>
-              </w:rPr>
-            </w:pPr>
-            <w:r>
-              <w:rPr>
-                <w:rFonts w:ascii="DejaVu Sans" w:hAnsi="DejaVu Sans" w:eastAsia="DejaVu Sans" w:cs="DejaVu Sans"/>
-                <w:i w:val="false"/>
-                <w:b w:val="false"/>
-                <w:u w:val="none"/>
-                <w:strike w:val="false"/>
-                <w:sz w:val="22"/>
-                <w:szCs w:val="22"/>
-                <w:color w:val="000000"/>
-              </w:rPr>
               <w:t xml:space="preserve"/>
             </w:r>
           </w:p>
@@ -2366,6 +2201,171 @@
             </w:r>
           </w:p>
         </w:tc>
+        <w:tc>
+          <w:tcPr>
+            <w:tcBorders>
+              <w:bottom w:val="single" w:sz="12" w:space="0" w:color="666666"/>
+              <w:top w:val="none" w:sz="0" w:space="0" w:color="000000"/>
+              <w:left w:val="none" w:sz="0" w:space="0" w:color="000000"/>
+              <w:right w:val="none" w:sz="0" w:space="0" w:color="000000"/>
+            </w:tcBorders>
+            <w:shd w:val="clear" w:color="auto" w:fill="FFFFFF"/>
+            <w:tcMar>
+              <w:top w:w="0" w:type="dxa"/>
+              <w:bottom w:w="0" w:type="dxa"/>
+              <w:left w:w="0" w:type="dxa"/>
+              <w:right w:w="0" w:type="dxa"/>
+            </w:tcMar>
+            <w:vAlign w:val="center"/>
+          </w:tcPr>
+          <w:p>
+            <w:pPr>
+              <w:pStyle w:val="Normal"/>
+              <w:jc w:val="left"/>
+              <w:pBdr>
+                <w:bottom w:val="none" w:sz="0" w:space="0" w:color="000000"/>
+                <w:top w:val="none" w:sz="0" w:space="0" w:color="000000"/>
+                <w:left w:val="none" w:sz="0" w:space="0" w:color="000000"/>
+                <w:right w:val="none" w:sz="0" w:space="0" w:color="000000"/>
+              </w:pBdr>
+              <w:spacing w:after="100" w:before="100" w:line="240"/>
+              <w:ind w:left="100" w:right="100" w:firstLine="0" w:firstLineChars="0"/>
+              <w:rPr>
+                <w:rFonts w:ascii="DejaVu Sans" w:hAnsi="DejaVu Sans" w:eastAsia="DejaVu Sans" w:cs="DejaVu Sans"/>
+                <w:i w:val="false"/>
+                <w:b w:val="false"/>
+                <w:u w:val="none"/>
+                <w:strike w:val="false"/>
+                <w:sz w:val="22"/>
+                <w:szCs w:val="22"/>
+                <w:color w:val="000000"/>
+              </w:rPr>
+            </w:pPr>
+            <w:r>
+              <w:rPr>
+                <w:rFonts w:ascii="DejaVu Sans" w:hAnsi="DejaVu Sans" w:eastAsia="DejaVu Sans" w:cs="DejaVu Sans"/>
+                <w:i w:val="false"/>
+                <w:b w:val="false"/>
+                <w:u w:val="none"/>
+                <w:strike w:val="false"/>
+                <w:sz w:val="22"/>
+                <w:szCs w:val="22"/>
+                <w:color w:val="000000"/>
+              </w:rPr>
+              <w:t xml:space="preserve">0.05426</w:t>
+            </w:r>
+          </w:p>
+        </w:tc>
+        <w:tc>
+          <w:tcPr>
+            <w:tcBorders>
+              <w:bottom w:val="single" w:sz="12" w:space="0" w:color="666666"/>
+              <w:top w:val="none" w:sz="0" w:space="0" w:color="000000"/>
+              <w:left w:val="none" w:sz="0" w:space="0" w:color="000000"/>
+              <w:right w:val="none" w:sz="0" w:space="0" w:color="000000"/>
+            </w:tcBorders>
+            <w:shd w:val="clear" w:color="auto" w:fill="FFFFFF"/>
+            <w:tcMar>
+              <w:top w:w="0" w:type="dxa"/>
+              <w:bottom w:w="0" w:type="dxa"/>
+              <w:left w:w="0" w:type="dxa"/>
+              <w:right w:w="0" w:type="dxa"/>
+            </w:tcMar>
+            <w:vAlign w:val="center"/>
+          </w:tcPr>
+          <w:p>
+            <w:pPr>
+              <w:pStyle w:val="Normal"/>
+              <w:jc w:val="left"/>
+              <w:pBdr>
+                <w:bottom w:val="none" w:sz="0" w:space="0" w:color="000000"/>
+                <w:top w:val="none" w:sz="0" w:space="0" w:color="000000"/>
+                <w:left w:val="none" w:sz="0" w:space="0" w:color="000000"/>
+                <w:right w:val="none" w:sz="0" w:space="0" w:color="000000"/>
+              </w:pBdr>
+              <w:spacing w:after="100" w:before="100" w:line="240"/>
+              <w:ind w:left="100" w:right="100" w:firstLine="0" w:firstLineChars="0"/>
+              <w:rPr>
+                <w:rFonts w:ascii="DejaVu Sans" w:hAnsi="DejaVu Sans" w:eastAsia="DejaVu Sans" w:cs="DejaVu Sans"/>
+                <w:i w:val="false"/>
+                <w:b w:val="false"/>
+                <w:u w:val="none"/>
+                <w:strike w:val="false"/>
+                <w:sz w:val="22"/>
+                <w:szCs w:val="22"/>
+                <w:color w:val="000000"/>
+              </w:rPr>
+            </w:pPr>
+            <w:r>
+              <w:rPr>
+                <w:rFonts w:ascii="DejaVu Sans" w:hAnsi="DejaVu Sans" w:eastAsia="DejaVu Sans" w:cs="DejaVu Sans"/>
+                <w:i w:val="false"/>
+                <w:b w:val="false"/>
+                <w:u w:val="none"/>
+                <w:strike w:val="false"/>
+                <w:sz w:val="22"/>
+                <w:szCs w:val="22"/>
+                <w:color w:val="000000"/>
+              </w:rPr>
+              <w:t xml:space="preserve"/>
+            </w:r>
+          </w:p>
+        </w:tc>
+        <w:tc>
+          <w:tcPr>
+            <w:tcBorders>
+              <w:bottom w:val="single" w:sz="12" w:space="0" w:color="666666"/>
+              <w:top w:val="none" w:sz="0" w:space="0" w:color="000000"/>
+              <w:left w:val="none" w:sz="0" w:space="0" w:color="000000"/>
+              <w:right w:val="none" w:sz="0" w:space="0" w:color="000000"/>
+            </w:tcBorders>
+            <w:shd w:val="clear" w:color="auto" w:fill="FFFFFF"/>
+            <w:tcMar>
+              <w:top w:w="0" w:type="dxa"/>
+              <w:bottom w:w="0" w:type="dxa"/>
+              <w:left w:w="0" w:type="dxa"/>
+              <w:right w:w="0" w:type="dxa"/>
+            </w:tcMar>
+            <w:vAlign w:val="center"/>
+          </w:tcPr>
+          <w:p>
+            <w:pPr>
+              <w:pStyle w:val="Normal"/>
+              <w:jc w:val="left"/>
+              <w:pBdr>
+                <w:bottom w:val="none" w:sz="0" w:space="0" w:color="000000"/>
+                <w:top w:val="none" w:sz="0" w:space="0" w:color="000000"/>
+                <w:left w:val="none" w:sz="0" w:space="0" w:color="000000"/>
+                <w:right w:val="none" w:sz="0" w:space="0" w:color="000000"/>
+              </w:pBdr>
+              <w:spacing w:after="100" w:before="100" w:line="240"/>
+              <w:ind w:left="100" w:right="100" w:firstLine="0" w:firstLineChars="0"/>
+              <w:rPr>
+                <w:rFonts w:ascii="DejaVu Sans" w:hAnsi="DejaVu Sans" w:eastAsia="DejaVu Sans" w:cs="DejaVu Sans"/>
+                <w:i w:val="false"/>
+                <w:b w:val="false"/>
+                <w:u w:val="none"/>
+                <w:strike w:val="false"/>
+                <w:sz w:val="22"/>
+                <w:szCs w:val="22"/>
+                <w:color w:val="000000"/>
+              </w:rPr>
+            </w:pPr>
+            <w:r>
+              <w:rPr>
+                <w:rFonts w:ascii="DejaVu Sans" w:hAnsi="DejaVu Sans" w:eastAsia="DejaVu Sans" w:cs="DejaVu Sans"/>
+                <w:i w:val="false"/>
+                <w:b w:val="false"/>
+                <w:u w:val="none"/>
+                <w:strike w:val="false"/>
+                <w:sz w:val="22"/>
+                <w:szCs w:val="22"/>
+                <w:color w:val="000000"/>
+              </w:rPr>
+              <w:t xml:space="preserve"/>
+            </w:r>
+          </w:p>
+        </w:tc>
       </w:tr>
     </w:tbl>
     <w:p>
@@ -2379,7 +2379,7 @@
         </w:rPr>
         <w:t xml:space="preserve">Table </w:t>
       </w:r>
-      <w:bookmarkStart w:id="ea7f6035-e5f3-496b-b3e6-7773981be98f" w:name="pest_table"/>
+      <w:bookmarkStart w:id="f69c0e72-ba94-4ecb-95e2-93211702a94d" w:name="pest_table"/>
       <w:r>
         <w:rPr/>
         <w:t xml:space="preserve"/>
@@ -2400,7 +2400,7 @@
         <w:rPr/>
         <w:t xml:space="preserve"/>
       </w:r>
-      <w:bookmarkEnd w:id="ea7f6035-e5f3-496b-b3e6-7773981be98f"/>
+      <w:bookmarkEnd w:id="f69c0e72-ba94-4ecb-95e2-93211702a94d"/>
       <w:r>
         <w:rPr>
           <w:rFonts/>
@@ -2496,7 +2496,7 @@
         </w:rPr>
         <w:t xml:space="preserve">Figure </w:t>
       </w:r>
-      <w:bookmarkStart w:id="d100573e-faeb-42db-91ba-7955ff49fec6" w:name="ind_plots"/>
+      <w:bookmarkStart w:id="e2195d8c-5390-4267-8033-909b9898eb88" w:name="ind_plots"/>
       <w:r>
         <w:rPr/>
         <w:t xml:space="preserve"/>
@@ -2517,7 +2517,7 @@
         <w:rPr/>
         <w:t xml:space="preserve"/>
       </w:r>
-      <w:bookmarkEnd w:id="d100573e-faeb-42db-91ba-7955ff49fec6"/>
+      <w:bookmarkEnd w:id="e2195d8c-5390-4267-8033-909b9898eb88"/>
       <w:r>
         <w:rPr>
           <w:rFonts/>
@@ -2599,7 +2599,7 @@
         </w:rPr>
         <w:t xml:space="preserve">Figure </w:t>
       </w:r>
-      <w:bookmarkStart w:id="38a7fae8-2b9c-47f1-80ca-7caecee1b31a" w:name="dv_vs_pred_ipred"/>
+      <w:bookmarkStart w:id="3f987975-9227-4c06-9586-835fe367a35c" w:name="dv_vs_pred_ipred"/>
       <w:r>
         <w:rPr/>
         <w:t xml:space="preserve"/>
@@ -2620,7 +2620,7 @@
         <w:rPr/>
         <w:t xml:space="preserve"/>
       </w:r>
-      <w:bookmarkEnd w:id="38a7fae8-2b9c-47f1-80ca-7caecee1b31a"/>
+      <w:bookmarkEnd w:id="3f987975-9227-4c06-9586-835fe367a35c"/>
       <w:r>
         <w:rPr>
           <w:rFonts/>
@@ -2708,7 +2708,7 @@
         </w:rPr>
         <w:t xml:space="preserve">Figure </w:t>
       </w:r>
-      <w:bookmarkStart w:id="3c239b73-b6a7-4b7a-9946-209f62f4f4f6" w:name="prm_vs_iteration"/>
+      <w:bookmarkStart w:id="babfe0ca-1233-4034-a72f-329d53cd95c0" w:name="prm_vs_iteration"/>
       <w:r>
         <w:rPr/>
         <w:t xml:space="preserve"/>
@@ -2729,7 +2729,7 @@
         <w:rPr/>
         <w:t xml:space="preserve"/>
       </w:r>
-      <w:bookmarkEnd w:id="3c239b73-b6a7-4b7a-9946-209f62f4f4f6"/>
+      <w:bookmarkEnd w:id="babfe0ca-1233-4034-a72f-329d53cd95c0"/>
       <w:r>
         <w:rPr>
           <w:rFonts/>

</xml_diff>

<commit_message>
Deploying to gh-pages from @ nlmixr2/monolix2rx@9a16308a32ad8e102e9afe194cdd5929fdbc86cd 🚀
</commit_message>
<xml_diff>
--- a/articles/mod-Word.docx
+++ b/articles/mod-Word.docx
@@ -2379,7 +2379,7 @@
         </w:rPr>
         <w:t xml:space="preserve">Table </w:t>
       </w:r>
-      <w:bookmarkStart w:id="f69c0e72-ba94-4ecb-95e2-93211702a94d" w:name="pest_table"/>
+      <w:bookmarkStart w:id="aae9f9c3-fe6f-46da-a565-ff06c9d76bbc" w:name="pest_table"/>
       <w:r>
         <w:rPr/>
         <w:t xml:space="preserve"/>
@@ -2400,7 +2400,7 @@
         <w:rPr/>
         <w:t xml:space="preserve"/>
       </w:r>
-      <w:bookmarkEnd w:id="f69c0e72-ba94-4ecb-95e2-93211702a94d"/>
+      <w:bookmarkEnd w:id="aae9f9c3-fe6f-46da-a565-ff06c9d76bbc"/>
       <w:r>
         <w:rPr>
           <w:rFonts/>
@@ -2496,7 +2496,7 @@
         </w:rPr>
         <w:t xml:space="preserve">Figure </w:t>
       </w:r>
-      <w:bookmarkStart w:id="e2195d8c-5390-4267-8033-909b9898eb88" w:name="ind_plots"/>
+      <w:bookmarkStart w:id="6d7ebed4-e32e-4bc1-8462-8901a8dc181f" w:name="ind_plots"/>
       <w:r>
         <w:rPr/>
         <w:t xml:space="preserve"/>
@@ -2517,7 +2517,7 @@
         <w:rPr/>
         <w:t xml:space="preserve"/>
       </w:r>
-      <w:bookmarkEnd w:id="e2195d8c-5390-4267-8033-909b9898eb88"/>
+      <w:bookmarkEnd w:id="6d7ebed4-e32e-4bc1-8462-8901a8dc181f"/>
       <w:r>
         <w:rPr>
           <w:rFonts/>
@@ -2599,7 +2599,7 @@
         </w:rPr>
         <w:t xml:space="preserve">Figure </w:t>
       </w:r>
-      <w:bookmarkStart w:id="3f987975-9227-4c06-9586-835fe367a35c" w:name="dv_vs_pred_ipred"/>
+      <w:bookmarkStart w:id="2e53103b-8a43-4652-b7d9-f4166c415806" w:name="dv_vs_pred_ipred"/>
       <w:r>
         <w:rPr/>
         <w:t xml:space="preserve"/>
@@ -2620,7 +2620,7 @@
         <w:rPr/>
         <w:t xml:space="preserve"/>
       </w:r>
-      <w:bookmarkEnd w:id="3f987975-9227-4c06-9586-835fe367a35c"/>
+      <w:bookmarkEnd w:id="2e53103b-8a43-4652-b7d9-f4166c415806"/>
       <w:r>
         <w:rPr>
           <w:rFonts/>
@@ -2708,7 +2708,7 @@
         </w:rPr>
         <w:t xml:space="preserve">Figure </w:t>
       </w:r>
-      <w:bookmarkStart w:id="babfe0ca-1233-4034-a72f-329d53cd95c0" w:name="prm_vs_iteration"/>
+      <w:bookmarkStart w:id="a6553b70-bb9c-4b51-9404-85daea6a4630" w:name="prm_vs_iteration"/>
       <w:r>
         <w:rPr/>
         <w:t xml:space="preserve"/>
@@ -2729,7 +2729,7 @@
         <w:rPr/>
         <w:t xml:space="preserve"/>
       </w:r>
-      <w:bookmarkEnd w:id="babfe0ca-1233-4034-a72f-329d53cd95c0"/>
+      <w:bookmarkEnd w:id="a6553b70-bb9c-4b51-9404-85daea6a4630"/>
       <w:r>
         <w:rPr>
           <w:rFonts/>

</xml_diff>

<commit_message>
Deploying to gh-pages from @ nlmixr2/monolix2rx@a3771fcc5185f1f16beb59914614a70d9faee362 🚀
</commit_message>
<xml_diff>
--- a/articles/mod-Word.docx
+++ b/articles/mod-Word.docx
@@ -2379,7 +2379,7 @@
         </w:rPr>
         <w:t xml:space="preserve">Table </w:t>
       </w:r>
-      <w:bookmarkStart w:id="aae9f9c3-fe6f-46da-a565-ff06c9d76bbc" w:name="pest_table"/>
+      <w:bookmarkStart w:id="b7d3314e-c74c-412d-9647-82bbf0e33b71" w:name="pest_table"/>
       <w:r>
         <w:rPr/>
         <w:t xml:space="preserve"/>
@@ -2400,7 +2400,7 @@
         <w:rPr/>
         <w:t xml:space="preserve"/>
       </w:r>
-      <w:bookmarkEnd w:id="aae9f9c3-fe6f-46da-a565-ff06c9d76bbc"/>
+      <w:bookmarkEnd w:id="b7d3314e-c74c-412d-9647-82bbf0e33b71"/>
       <w:r>
         <w:rPr>
           <w:rFonts/>
@@ -2496,7 +2496,7 @@
         </w:rPr>
         <w:t xml:space="preserve">Figure </w:t>
       </w:r>
-      <w:bookmarkStart w:id="6d7ebed4-e32e-4bc1-8462-8901a8dc181f" w:name="ind_plots"/>
+      <w:bookmarkStart w:id="9fc1c9cd-5ffa-4cae-b058-2dbcf10130fb" w:name="ind_plots"/>
       <w:r>
         <w:rPr/>
         <w:t xml:space="preserve"/>
@@ -2517,7 +2517,7 @@
         <w:rPr/>
         <w:t xml:space="preserve"/>
       </w:r>
-      <w:bookmarkEnd w:id="6d7ebed4-e32e-4bc1-8462-8901a8dc181f"/>
+      <w:bookmarkEnd w:id="9fc1c9cd-5ffa-4cae-b058-2dbcf10130fb"/>
       <w:r>
         <w:rPr>
           <w:rFonts/>
@@ -2599,7 +2599,7 @@
         </w:rPr>
         <w:t xml:space="preserve">Figure </w:t>
       </w:r>
-      <w:bookmarkStart w:id="2e53103b-8a43-4652-b7d9-f4166c415806" w:name="dv_vs_pred_ipred"/>
+      <w:bookmarkStart w:id="3638f9e2-ebee-4077-a054-fa6c1f5423a7" w:name="dv_vs_pred_ipred"/>
       <w:r>
         <w:rPr/>
         <w:t xml:space="preserve"/>
@@ -2620,7 +2620,7 @@
         <w:rPr/>
         <w:t xml:space="preserve"/>
       </w:r>
-      <w:bookmarkEnd w:id="2e53103b-8a43-4652-b7d9-f4166c415806"/>
+      <w:bookmarkEnd w:id="3638f9e2-ebee-4077-a054-fa6c1f5423a7"/>
       <w:r>
         <w:rPr>
           <w:rFonts/>
@@ -2708,7 +2708,7 @@
         </w:rPr>
         <w:t xml:space="preserve">Figure </w:t>
       </w:r>
-      <w:bookmarkStart w:id="a6553b70-bb9c-4b51-9404-85daea6a4630" w:name="prm_vs_iteration"/>
+      <w:bookmarkStart w:id="253d0577-ddb7-481c-967b-c204ed3fb0c2" w:name="prm_vs_iteration"/>
       <w:r>
         <w:rPr/>
         <w:t xml:space="preserve"/>
@@ -2729,7 +2729,7 @@
         <w:rPr/>
         <w:t xml:space="preserve"/>
       </w:r>
-      <w:bookmarkEnd w:id="a6553b70-bb9c-4b51-9404-85daea6a4630"/>
+      <w:bookmarkEnd w:id="253d0577-ddb7-481c-967b-c204ed3fb0c2"/>
       <w:r>
         <w:rPr>
           <w:rFonts/>

</xml_diff>

<commit_message>
Deploying to gh-pages from @ nlmixr2/monolix2rx@79fae79803370ecafda512bfde51a7205173c229 🚀
</commit_message>
<xml_diff>
--- a/articles/mod-Word.docx
+++ b/articles/mod-Word.docx
@@ -2379,7 +2379,7 @@
         </w:rPr>
         <w:t xml:space="preserve">Table </w:t>
       </w:r>
-      <w:bookmarkStart w:id="b7d3314e-c74c-412d-9647-82bbf0e33b71" w:name="pest_table"/>
+      <w:bookmarkStart w:id="6880e7c0-7c90-4b86-8ec1-2c379a4c008e" w:name="pest_table"/>
       <w:r>
         <w:rPr/>
         <w:t xml:space="preserve"/>
@@ -2400,7 +2400,7 @@
         <w:rPr/>
         <w:t xml:space="preserve"/>
       </w:r>
-      <w:bookmarkEnd w:id="b7d3314e-c74c-412d-9647-82bbf0e33b71"/>
+      <w:bookmarkEnd w:id="6880e7c0-7c90-4b86-8ec1-2c379a4c008e"/>
       <w:r>
         <w:rPr>
           <w:rFonts/>
@@ -2496,7 +2496,7 @@
         </w:rPr>
         <w:t xml:space="preserve">Figure </w:t>
       </w:r>
-      <w:bookmarkStart w:id="9fc1c9cd-5ffa-4cae-b058-2dbcf10130fb" w:name="ind_plots"/>
+      <w:bookmarkStart w:id="a6681756-ab55-4a40-b1f2-dbeddb7eb4f5" w:name="ind_plots"/>
       <w:r>
         <w:rPr/>
         <w:t xml:space="preserve"/>
@@ -2517,7 +2517,7 @@
         <w:rPr/>
         <w:t xml:space="preserve"/>
       </w:r>
-      <w:bookmarkEnd w:id="9fc1c9cd-5ffa-4cae-b058-2dbcf10130fb"/>
+      <w:bookmarkEnd w:id="a6681756-ab55-4a40-b1f2-dbeddb7eb4f5"/>
       <w:r>
         <w:rPr>
           <w:rFonts/>
@@ -2599,7 +2599,7 @@
         </w:rPr>
         <w:t xml:space="preserve">Figure </w:t>
       </w:r>
-      <w:bookmarkStart w:id="3638f9e2-ebee-4077-a054-fa6c1f5423a7" w:name="dv_vs_pred_ipred"/>
+      <w:bookmarkStart w:id="b17e53f2-504c-4657-a165-2b98fa28f5b8" w:name="dv_vs_pred_ipred"/>
       <w:r>
         <w:rPr/>
         <w:t xml:space="preserve"/>
@@ -2620,7 +2620,7 @@
         <w:rPr/>
         <w:t xml:space="preserve"/>
       </w:r>
-      <w:bookmarkEnd w:id="3638f9e2-ebee-4077-a054-fa6c1f5423a7"/>
+      <w:bookmarkEnd w:id="b17e53f2-504c-4657-a165-2b98fa28f5b8"/>
       <w:r>
         <w:rPr>
           <w:rFonts/>
@@ -2708,7 +2708,7 @@
         </w:rPr>
         <w:t xml:space="preserve">Figure </w:t>
       </w:r>
-      <w:bookmarkStart w:id="253d0577-ddb7-481c-967b-c204ed3fb0c2" w:name="prm_vs_iteration"/>
+      <w:bookmarkStart w:id="ea501234-b8f6-42b4-abec-866bd1f7afb2" w:name="prm_vs_iteration"/>
       <w:r>
         <w:rPr/>
         <w:t xml:space="preserve"/>
@@ -2729,7 +2729,7 @@
         <w:rPr/>
         <w:t xml:space="preserve"/>
       </w:r>
-      <w:bookmarkEnd w:id="253d0577-ddb7-481c-967b-c204ed3fb0c2"/>
+      <w:bookmarkEnd w:id="ea501234-b8f6-42b4-abec-866bd1f7afb2"/>
       <w:r>
         <w:rPr>
           <w:rFonts/>

</xml_diff>

<commit_message>
Deploying to gh-pages from @ nlmixr2/monolix2rx@6e9d277d7cd08b87dedf810c2607bd777f0e7414 🚀
</commit_message>
<xml_diff>
--- a/articles/mod-Word.docx
+++ b/articles/mod-Word.docx
@@ -19,10 +19,10 @@
       </w:tblPr>
       <w:tblGrid>
         <w:gridCol w:w="1565"/>
-        <w:gridCol w:w="1320"/>
-        <w:gridCol w:w="1320"/>
+        <w:gridCol w:w="1180"/>
+        <w:gridCol w:w="1180"/>
         <w:gridCol w:w="1051"/>
-        <w:gridCol w:w="3521"/>
+        <w:gridCol w:w="3261"/>
         <w:gridCol w:w="1537"/>
         <w:gridCol w:w="1798"/>
       </w:tblGrid>
@@ -527,7 +527,7 @@
                 <w:szCs w:val="22"/>
                 <w:color w:val="000000"/>
               </w:rPr>
-              <w:t xml:space="preserve">0.4270</w:t>
+              <w:t xml:space="preserve">0.427</w:t>
             </w:r>
           </w:p>
         </w:tc>
@@ -582,7 +582,7 @@
                 <w:szCs w:val="22"/>
                 <w:color w:val="000000"/>
               </w:rPr>
-              <w:t xml:space="preserve">0.2041</w:t>
+              <w:t xml:space="preserve">0.204</w:t>
             </w:r>
           </w:p>
         </w:tc>
@@ -637,7 +637,7 @@
                 <w:szCs w:val="22"/>
                 <w:color w:val="000000"/>
               </w:rPr>
-              <w:t xml:space="preserve">47.80</w:t>
+              <w:t xml:space="preserve">47.8</w:t>
             </w:r>
           </w:p>
         </w:tc>
@@ -692,7 +692,7 @@
                 <w:szCs w:val="22"/>
                 <w:color w:val="000000"/>
               </w:rPr>
-              <w:t xml:space="preserve">1.533 (1.027, 2.286)</w:t>
+              <w:t xml:space="preserve">1.53 (1.03, 2.29)</w:t>
             </w:r>
           </w:p>
         </w:tc>
@@ -747,7 +747,7 @@
                 <w:szCs w:val="22"/>
                 <w:color w:val="000000"/>
               </w:rPr>
-              <w:t xml:space="preserve">75.42</w:t>
+              <w:t xml:space="preserve">75.4</w:t>
             </w:r>
           </w:p>
         </w:tc>
@@ -802,7 +802,7 @@
                 <w:szCs w:val="22"/>
                 <w:color w:val="000000"/>
               </w:rPr>
-              <w:t xml:space="preserve">1.055&lt;</w:t>
+              <w:t xml:space="preserve">1.05&lt;</w:t>
             </w:r>
           </w:p>
         </w:tc>
@@ -917,7 +917,7 @@
                 <w:szCs w:val="22"/>
                 <w:color w:val="000000"/>
               </w:rPr>
-              <w:t xml:space="preserve">-0.7864</w:t>
+              <w:t xml:space="preserve">-0.786</w:t>
             </w:r>
           </w:p>
         </w:tc>
@@ -972,7 +972,7 @@
                 <w:szCs w:val="22"/>
                 <w:color w:val="000000"/>
               </w:rPr>
-              <w:t xml:space="preserve">0.04496</w:t>
+              <w:t xml:space="preserve">0.0450</w:t>
             </w:r>
           </w:p>
         </w:tc>
@@ -1027,7 +1027,7 @@
                 <w:szCs w:val="22"/>
                 <w:color w:val="000000"/>
               </w:rPr>
-              <w:t xml:space="preserve">5.717</w:t>
+              <w:t xml:space="preserve">5.72</w:t>
             </w:r>
           </w:p>
         </w:tc>
@@ -1082,7 +1082,7 @@
                 <w:szCs w:val="22"/>
                 <w:color w:val="000000"/>
               </w:rPr>
-              <w:t xml:space="preserve">0.4555 (0.4171, 0.4975)</w:t>
+              <w:t xml:space="preserve">0.456 (0.417, 0.497)</w:t>
             </w:r>
           </w:p>
         </w:tc>
@@ -1137,7 +1137,7 @@
                 <w:szCs w:val="22"/>
                 <w:color w:val="000000"/>
               </w:rPr>
-              <w:t xml:space="preserve">12.68</w:t>
+              <w:t xml:space="preserve">12.7</w:t>
             </w:r>
           </w:p>
         </w:tc>
@@ -1192,7 +1192,7 @@
                 <w:szCs w:val="22"/>
                 <w:color w:val="000000"/>
               </w:rPr>
-              <w:t xml:space="preserve">13.29&lt;</w:t>
+              <w:t xml:space="preserve">13.3&lt;</w:t>
             </w:r>
           </w:p>
         </w:tc>
@@ -1307,7 +1307,7 @@
                 <w:szCs w:val="22"/>
                 <w:color w:val="000000"/>
               </w:rPr>
-              <w:t xml:space="preserve">-3.215</w:t>
+              <w:t xml:space="preserve">-3.21</w:t>
             </w:r>
           </w:p>
         </w:tc>
@@ -1362,7 +1362,7 @@
                 <w:szCs w:val="22"/>
                 <w:color w:val="000000"/>
               </w:rPr>
-              <w:t xml:space="preserve">0.08374</w:t>
+              <w:t xml:space="preserve">0.0837</w:t>
             </w:r>
           </w:p>
         </w:tc>
@@ -1417,7 +1417,7 @@
                 <w:szCs w:val="22"/>
                 <w:color w:val="000000"/>
               </w:rPr>
-              <w:t xml:space="preserve">2.605</w:t>
+              <w:t xml:space="preserve">2.61</w:t>
             </w:r>
           </w:p>
         </w:tc>
@@ -1472,7 +1472,7 @@
                 <w:szCs w:val="22"/>
                 <w:color w:val="000000"/>
               </w:rPr>
-              <w:t xml:space="preserve">0.04017 (0.03409, 0.04734)</w:t>
+              <w:t xml:space="preserve">0.0402 (0.0341, 0.0473)</w:t>
             </w:r>
           </w:p>
         </w:tc>
@@ -1527,7 +1527,7 @@
                 <w:szCs w:val="22"/>
                 <w:color w:val="000000"/>
               </w:rPr>
-              <w:t xml:space="preserve">27.57</w:t>
+              <w:t xml:space="preserve">27.6</w:t>
             </w:r>
           </w:p>
         </w:tc>
@@ -1582,7 +1582,7 @@
                 <w:szCs w:val="22"/>
                 <w:color w:val="000000"/>
               </w:rPr>
-              <w:t xml:space="preserve">2.648&lt;</w:t>
+              <w:t xml:space="preserve">2.65&lt;</w:t>
             </w:r>
           </w:p>
         </w:tc>
@@ -1697,7 +1697,7 @@
                 <w:szCs w:val="22"/>
                 <w:color w:val="000000"/>
               </w:rPr>
-              <w:t xml:space="preserve">0.4333</w:t>
+              <w:t xml:space="preserve">0.433</w:t>
             </w:r>
           </w:p>
         </w:tc>
@@ -1862,7 +1862,7 @@
                 <w:szCs w:val="22"/>
                 <w:color w:val="000000"/>
               </w:rPr>
-              <w:t xml:space="preserve">0.4333</w:t>
+              <w:t xml:space="preserve">0.433</w:t>
             </w:r>
           </w:p>
         </w:tc>
@@ -2087,7 +2087,7 @@
                 <w:szCs w:val="22"/>
                 <w:color w:val="000000"/>
               </w:rPr>
-              <w:t xml:space="preserve">0.05426</w:t>
+              <w:t xml:space="preserve">0.0543</w:t>
             </w:r>
           </w:p>
         </w:tc>
@@ -2252,7 +2252,7 @@
                 <w:szCs w:val="22"/>
                 <w:color w:val="000000"/>
               </w:rPr>
-              <w:t xml:space="preserve">0.05426</w:t>
+              <w:t xml:space="preserve">0.0543</w:t>
             </w:r>
           </w:p>
         </w:tc>
@@ -2379,7 +2379,7 @@
         </w:rPr>
         <w:t xml:space="preserve">Table </w:t>
       </w:r>
-      <w:bookmarkStart w:id="6880e7c0-7c90-4b86-8ec1-2c379a4c008e" w:name="pest_table"/>
+      <w:bookmarkStart w:id="58bb1dfd-4585-4efe-be90-bc02fe96b572" w:name="pest_table"/>
       <w:r>
         <w:rPr/>
         <w:t xml:space="preserve"/>
@@ -2400,7 +2400,7 @@
         <w:rPr/>
         <w:t xml:space="preserve"/>
       </w:r>
-      <w:bookmarkEnd w:id="6880e7c0-7c90-4b86-8ec1-2c379a4c008e"/>
+      <w:bookmarkEnd w:id="58bb1dfd-4585-4efe-be90-bc02fe96b572"/>
       <w:r>
         <w:rPr>
           <w:rFonts/>
@@ -2496,7 +2496,7 @@
         </w:rPr>
         <w:t xml:space="preserve">Figure </w:t>
       </w:r>
-      <w:bookmarkStart w:id="a6681756-ab55-4a40-b1f2-dbeddb7eb4f5" w:name="ind_plots"/>
+      <w:bookmarkStart w:id="fc8d63f3-f073-4d9e-9fe6-4953a390e2f1" w:name="ind_plots"/>
       <w:r>
         <w:rPr/>
         <w:t xml:space="preserve"/>
@@ -2517,7 +2517,7 @@
         <w:rPr/>
         <w:t xml:space="preserve"/>
       </w:r>
-      <w:bookmarkEnd w:id="a6681756-ab55-4a40-b1f2-dbeddb7eb4f5"/>
+      <w:bookmarkEnd w:id="fc8d63f3-f073-4d9e-9fe6-4953a390e2f1"/>
       <w:r>
         <w:rPr>
           <w:rFonts/>
@@ -2599,7 +2599,7 @@
         </w:rPr>
         <w:t xml:space="preserve">Figure </w:t>
       </w:r>
-      <w:bookmarkStart w:id="b17e53f2-504c-4657-a165-2b98fa28f5b8" w:name="dv_vs_pred_ipred"/>
+      <w:bookmarkStart w:id="9f2b9c35-1499-437d-9f30-9591c9ee24ec" w:name="dv_vs_pred_ipred"/>
       <w:r>
         <w:rPr/>
         <w:t xml:space="preserve"/>
@@ -2620,7 +2620,7 @@
         <w:rPr/>
         <w:t xml:space="preserve"/>
       </w:r>
-      <w:bookmarkEnd w:id="b17e53f2-504c-4657-a165-2b98fa28f5b8"/>
+      <w:bookmarkEnd w:id="9f2b9c35-1499-437d-9f30-9591c9ee24ec"/>
       <w:r>
         <w:rPr>
           <w:rFonts/>
@@ -2708,7 +2708,7 @@
         </w:rPr>
         <w:t xml:space="preserve">Figure </w:t>
       </w:r>
-      <w:bookmarkStart w:id="ea501234-b8f6-42b4-abec-866bd1f7afb2" w:name="prm_vs_iteration"/>
+      <w:bookmarkStart w:id="b5acb4d3-ed67-40ee-a18c-46f623c21a4c" w:name="prm_vs_iteration"/>
       <w:r>
         <w:rPr/>
         <w:t xml:space="preserve"/>
@@ -2729,7 +2729,7 @@
         <w:rPr/>
         <w:t xml:space="preserve"/>
       </w:r>
-      <w:bookmarkEnd w:id="ea501234-b8f6-42b4-abec-866bd1f7afb2"/>
+      <w:bookmarkEnd w:id="b5acb4d3-ed67-40ee-a18c-46f623c21a4c"/>
       <w:r>
         <w:rPr>
           <w:rFonts/>

</xml_diff>

<commit_message>
Deploying to gh-pages from @ nlmixr2/monolix2rx@109437485870bb4567f2dbd19ec4ba3eb94f0215 🚀
</commit_message>
<xml_diff>
--- a/articles/mod-Word.docx
+++ b/articles/mod-Word.docx
@@ -2379,7 +2379,7 @@
         </w:rPr>
         <w:t xml:space="preserve">Table </w:t>
       </w:r>
-      <w:bookmarkStart w:id="58bb1dfd-4585-4efe-be90-bc02fe96b572" w:name="pest_table"/>
+      <w:bookmarkStart w:id="c5a285f0-d029-4264-9d4e-d2a2c8a156da" w:name="pest_table"/>
       <w:r>
         <w:rPr/>
         <w:t xml:space="preserve"/>
@@ -2400,7 +2400,7 @@
         <w:rPr/>
         <w:t xml:space="preserve"/>
       </w:r>
-      <w:bookmarkEnd w:id="58bb1dfd-4585-4efe-be90-bc02fe96b572"/>
+      <w:bookmarkEnd w:id="c5a285f0-d029-4264-9d4e-d2a2c8a156da"/>
       <w:r>
         <w:rPr>
           <w:rFonts/>
@@ -2496,7 +2496,7 @@
         </w:rPr>
         <w:t xml:space="preserve">Figure </w:t>
       </w:r>
-      <w:bookmarkStart w:id="fc8d63f3-f073-4d9e-9fe6-4953a390e2f1" w:name="ind_plots"/>
+      <w:bookmarkStart w:id="d6428250-3ce1-43ab-ba9f-6e3af472ca82" w:name="ind_plots"/>
       <w:r>
         <w:rPr/>
         <w:t xml:space="preserve"/>
@@ -2517,7 +2517,7 @@
         <w:rPr/>
         <w:t xml:space="preserve"/>
       </w:r>
-      <w:bookmarkEnd w:id="fc8d63f3-f073-4d9e-9fe6-4953a390e2f1"/>
+      <w:bookmarkEnd w:id="d6428250-3ce1-43ab-ba9f-6e3af472ca82"/>
       <w:r>
         <w:rPr>
           <w:rFonts/>
@@ -2599,7 +2599,7 @@
         </w:rPr>
         <w:t xml:space="preserve">Figure </w:t>
       </w:r>
-      <w:bookmarkStart w:id="9f2b9c35-1499-437d-9f30-9591c9ee24ec" w:name="dv_vs_pred_ipred"/>
+      <w:bookmarkStart w:id="c5193e4e-912c-4237-8f59-053a02e5c27f" w:name="dv_vs_pred_ipred"/>
       <w:r>
         <w:rPr/>
         <w:t xml:space="preserve"/>
@@ -2620,7 +2620,7 @@
         <w:rPr/>
         <w:t xml:space="preserve"/>
       </w:r>
-      <w:bookmarkEnd w:id="9f2b9c35-1499-437d-9f30-9591c9ee24ec"/>
+      <w:bookmarkEnd w:id="c5193e4e-912c-4237-8f59-053a02e5c27f"/>
       <w:r>
         <w:rPr>
           <w:rFonts/>
@@ -2708,7 +2708,7 @@
         </w:rPr>
         <w:t xml:space="preserve">Figure </w:t>
       </w:r>
-      <w:bookmarkStart w:id="b5acb4d3-ed67-40ee-a18c-46f623c21a4c" w:name="prm_vs_iteration"/>
+      <w:bookmarkStart w:id="eb8f61a2-d86c-4f39-b69c-c7bbb64e7022" w:name="prm_vs_iteration"/>
       <w:r>
         <w:rPr/>
         <w:t xml:space="preserve"/>
@@ -2729,7 +2729,7 @@
         <w:rPr/>
         <w:t xml:space="preserve"/>
       </w:r>
-      <w:bookmarkEnd w:id="b5acb4d3-ed67-40ee-a18c-46f623c21a4c"/>
+      <w:bookmarkEnd w:id="eb8f61a2-d86c-4f39-b69c-c7bbb64e7022"/>
       <w:r>
         <w:rPr>
           <w:rFonts/>

</xml_diff>

<commit_message>
Deploying to gh-pages from @ nlmixr2/monolix2rx@fd9eb76f788fc39a176998e60b21cc425b0c2881 🚀
</commit_message>
<xml_diff>
--- a/articles/mod-Word.docx
+++ b/articles/mod-Word.docx
@@ -2379,7 +2379,7 @@
         </w:rPr>
         <w:t xml:space="preserve">Table </w:t>
       </w:r>
-      <w:bookmarkStart w:id="c5a285f0-d029-4264-9d4e-d2a2c8a156da" w:name="pest_table"/>
+      <w:bookmarkStart w:id="2090267e-b18e-41e0-8a32-a2475d99ddd4" w:name="pest_table"/>
       <w:r>
         <w:rPr/>
         <w:t xml:space="preserve"/>
@@ -2400,7 +2400,7 @@
         <w:rPr/>
         <w:t xml:space="preserve"/>
       </w:r>
-      <w:bookmarkEnd w:id="c5a285f0-d029-4264-9d4e-d2a2c8a156da"/>
+      <w:bookmarkEnd w:id="2090267e-b18e-41e0-8a32-a2475d99ddd4"/>
       <w:r>
         <w:rPr>
           <w:rFonts/>
@@ -2496,7 +2496,7 @@
         </w:rPr>
         <w:t xml:space="preserve">Figure </w:t>
       </w:r>
-      <w:bookmarkStart w:id="d6428250-3ce1-43ab-ba9f-6e3af472ca82" w:name="ind_plots"/>
+      <w:bookmarkStart w:id="19e255fb-3b6a-49a3-9ab5-0e8a91606f29" w:name="ind_plots"/>
       <w:r>
         <w:rPr/>
         <w:t xml:space="preserve"/>
@@ -2517,7 +2517,7 @@
         <w:rPr/>
         <w:t xml:space="preserve"/>
       </w:r>
-      <w:bookmarkEnd w:id="d6428250-3ce1-43ab-ba9f-6e3af472ca82"/>
+      <w:bookmarkEnd w:id="19e255fb-3b6a-49a3-9ab5-0e8a91606f29"/>
       <w:r>
         <w:rPr>
           <w:rFonts/>
@@ -2599,7 +2599,7 @@
         </w:rPr>
         <w:t xml:space="preserve">Figure </w:t>
       </w:r>
-      <w:bookmarkStart w:id="c5193e4e-912c-4237-8f59-053a02e5c27f" w:name="dv_vs_pred_ipred"/>
+      <w:bookmarkStart w:id="7176dbd4-e83a-4030-9b6a-1a0b38667d24" w:name="dv_vs_pred_ipred"/>
       <w:r>
         <w:rPr/>
         <w:t xml:space="preserve"/>
@@ -2620,7 +2620,7 @@
         <w:rPr/>
         <w:t xml:space="preserve"/>
       </w:r>
-      <w:bookmarkEnd w:id="c5193e4e-912c-4237-8f59-053a02e5c27f"/>
+      <w:bookmarkEnd w:id="7176dbd4-e83a-4030-9b6a-1a0b38667d24"/>
       <w:r>
         <w:rPr>
           <w:rFonts/>
@@ -2708,7 +2708,7 @@
         </w:rPr>
         <w:t xml:space="preserve">Figure </w:t>
       </w:r>
-      <w:bookmarkStart w:id="eb8f61a2-d86c-4f39-b69c-c7bbb64e7022" w:name="prm_vs_iteration"/>
+      <w:bookmarkStart w:id="b7a38d16-9c02-4a70-83bf-1a03c73048eb" w:name="prm_vs_iteration"/>
       <w:r>
         <w:rPr/>
         <w:t xml:space="preserve"/>
@@ -2729,7 +2729,7 @@
         <w:rPr/>
         <w:t xml:space="preserve"/>
       </w:r>
-      <w:bookmarkEnd w:id="eb8f61a2-d86c-4f39-b69c-c7bbb64e7022"/>
+      <w:bookmarkEnd w:id="b7a38d16-9c02-4a70-83bf-1a03c73048eb"/>
       <w:r>
         <w:rPr>
           <w:rFonts/>

</xml_diff>

<commit_message>
Deploying to gh-pages from @ nlmixr2/monolix2rx@fb33da48ada959b5a8d055d87bb6fbd19df32841 🚀
</commit_message>
<xml_diff>
--- a/articles/mod-Word.docx
+++ b/articles/mod-Word.docx
@@ -2379,7 +2379,7 @@
         </w:rPr>
         <w:t xml:space="preserve">Table </w:t>
       </w:r>
-      <w:bookmarkStart w:id="2090267e-b18e-41e0-8a32-a2475d99ddd4" w:name="pest_table"/>
+      <w:bookmarkStart w:id="18ae50aa-9f03-4c4c-beab-7614e84c27bd" w:name="pest_table"/>
       <w:r>
         <w:rPr/>
         <w:t xml:space="preserve"/>
@@ -2400,7 +2400,7 @@
         <w:rPr/>
         <w:t xml:space="preserve"/>
       </w:r>
-      <w:bookmarkEnd w:id="2090267e-b18e-41e0-8a32-a2475d99ddd4"/>
+      <w:bookmarkEnd w:id="18ae50aa-9f03-4c4c-beab-7614e84c27bd"/>
       <w:r>
         <w:rPr>
           <w:rFonts/>
@@ -2496,7 +2496,7 @@
         </w:rPr>
         <w:t xml:space="preserve">Figure </w:t>
       </w:r>
-      <w:bookmarkStart w:id="19e255fb-3b6a-49a3-9ab5-0e8a91606f29" w:name="ind_plots"/>
+      <w:bookmarkStart w:id="ce790744-f12b-4d83-beda-dd83e8bb66c2" w:name="ind_plots"/>
       <w:r>
         <w:rPr/>
         <w:t xml:space="preserve"/>
@@ -2517,7 +2517,7 @@
         <w:rPr/>
         <w:t xml:space="preserve"/>
       </w:r>
-      <w:bookmarkEnd w:id="19e255fb-3b6a-49a3-9ab5-0e8a91606f29"/>
+      <w:bookmarkEnd w:id="ce790744-f12b-4d83-beda-dd83e8bb66c2"/>
       <w:r>
         <w:rPr>
           <w:rFonts/>
@@ -2599,7 +2599,7 @@
         </w:rPr>
         <w:t xml:space="preserve">Figure </w:t>
       </w:r>
-      <w:bookmarkStart w:id="7176dbd4-e83a-4030-9b6a-1a0b38667d24" w:name="dv_vs_pred_ipred"/>
+      <w:bookmarkStart w:id="0afbdb43-449a-4ed8-914a-02d62bb7d8d8" w:name="dv_vs_pred_ipred"/>
       <w:r>
         <w:rPr/>
         <w:t xml:space="preserve"/>
@@ -2620,7 +2620,7 @@
         <w:rPr/>
         <w:t xml:space="preserve"/>
       </w:r>
-      <w:bookmarkEnd w:id="7176dbd4-e83a-4030-9b6a-1a0b38667d24"/>
+      <w:bookmarkEnd w:id="0afbdb43-449a-4ed8-914a-02d62bb7d8d8"/>
       <w:r>
         <w:rPr>
           <w:rFonts/>
@@ -2708,7 +2708,7 @@
         </w:rPr>
         <w:t xml:space="preserve">Figure </w:t>
       </w:r>
-      <w:bookmarkStart w:id="b7a38d16-9c02-4a70-83bf-1a03c73048eb" w:name="prm_vs_iteration"/>
+      <w:bookmarkStart w:id="a9c2046a-8ae4-44ee-bc64-bf241ebc94fb" w:name="prm_vs_iteration"/>
       <w:r>
         <w:rPr/>
         <w:t xml:space="preserve"/>
@@ -2729,7 +2729,7 @@
         <w:rPr/>
         <w:t xml:space="preserve"/>
       </w:r>
-      <w:bookmarkEnd w:id="b7a38d16-9c02-4a70-83bf-1a03c73048eb"/>
+      <w:bookmarkEnd w:id="a9c2046a-8ae4-44ee-bc64-bf241ebc94fb"/>
       <w:r>
         <w:rPr>
           <w:rFonts/>

</xml_diff>

<commit_message>
Deploying to gh-pages from @ nlmixr2/monolix2rx@d109578ce4047af67a3581715829ec56bf240750 🚀
</commit_message>
<xml_diff>
--- a/articles/mod-Word.docx
+++ b/articles/mod-Word.docx
@@ -2379,7 +2379,7 @@
         </w:rPr>
         <w:t xml:space="preserve">Table </w:t>
       </w:r>
-      <w:bookmarkStart w:id="18ae50aa-9f03-4c4c-beab-7614e84c27bd" w:name="pest_table"/>
+      <w:bookmarkStart w:id="6e075395-79e8-43bc-a0da-ba2ed19cc3ba" w:name="pest_table"/>
       <w:r>
         <w:rPr/>
         <w:t xml:space="preserve"/>
@@ -2400,7 +2400,7 @@
         <w:rPr/>
         <w:t xml:space="preserve"/>
       </w:r>
-      <w:bookmarkEnd w:id="18ae50aa-9f03-4c4c-beab-7614e84c27bd"/>
+      <w:bookmarkEnd w:id="6e075395-79e8-43bc-a0da-ba2ed19cc3ba"/>
       <w:r>
         <w:rPr>
           <w:rFonts/>
@@ -2496,7 +2496,7 @@
         </w:rPr>
         <w:t xml:space="preserve">Figure </w:t>
       </w:r>
-      <w:bookmarkStart w:id="ce790744-f12b-4d83-beda-dd83e8bb66c2" w:name="ind_plots"/>
+      <w:bookmarkStart w:id="cd0c911d-e288-4377-80da-5cba94b08a11" w:name="ind_plots"/>
       <w:r>
         <w:rPr/>
         <w:t xml:space="preserve"/>
@@ -2517,7 +2517,7 @@
         <w:rPr/>
         <w:t xml:space="preserve"/>
       </w:r>
-      <w:bookmarkEnd w:id="ce790744-f12b-4d83-beda-dd83e8bb66c2"/>
+      <w:bookmarkEnd w:id="cd0c911d-e288-4377-80da-5cba94b08a11"/>
       <w:r>
         <w:rPr>
           <w:rFonts/>
@@ -2599,7 +2599,7 @@
         </w:rPr>
         <w:t xml:space="preserve">Figure </w:t>
       </w:r>
-      <w:bookmarkStart w:id="0afbdb43-449a-4ed8-914a-02d62bb7d8d8" w:name="dv_vs_pred_ipred"/>
+      <w:bookmarkStart w:id="a7a2d02c-53ed-4d7e-9acd-0bff3ac1b12e" w:name="dv_vs_pred_ipred"/>
       <w:r>
         <w:rPr/>
         <w:t xml:space="preserve"/>
@@ -2620,7 +2620,7 @@
         <w:rPr/>
         <w:t xml:space="preserve"/>
       </w:r>
-      <w:bookmarkEnd w:id="0afbdb43-449a-4ed8-914a-02d62bb7d8d8"/>
+      <w:bookmarkEnd w:id="a7a2d02c-53ed-4d7e-9acd-0bff3ac1b12e"/>
       <w:r>
         <w:rPr>
           <w:rFonts/>
@@ -2708,7 +2708,7 @@
         </w:rPr>
         <w:t xml:space="preserve">Figure </w:t>
       </w:r>
-      <w:bookmarkStart w:id="a9c2046a-8ae4-44ee-bc64-bf241ebc94fb" w:name="prm_vs_iteration"/>
+      <w:bookmarkStart w:id="b983d88c-48c0-4587-8a10-d8cc0a36987e" w:name="prm_vs_iteration"/>
       <w:r>
         <w:rPr/>
         <w:t xml:space="preserve"/>
@@ -2729,7 +2729,7 @@
         <w:rPr/>
         <w:t xml:space="preserve"/>
       </w:r>
-      <w:bookmarkEnd w:id="a9c2046a-8ae4-44ee-bc64-bf241ebc94fb"/>
+      <w:bookmarkEnd w:id="b983d88c-48c0-4587-8a10-d8cc0a36987e"/>
       <w:r>
         <w:rPr>
           <w:rFonts/>

</xml_diff>